<commit_message>
switch entity identifiers from guid to int
</commit_message>
<xml_diff>
--- a/docs/HappyPet-Frontend-Integration-Guide.docx
+++ b/docs/HappyPet-Frontend-Integration-Guide.docx
@@ -6677,7 +6677,7 @@
                 <w:sz w:val="17"/>
                 <w:szCs w:val="17"/>
               </w:rPr>
-              <w:t xml:space="preserve">UUID v4, lowercase, ხაზებით — მაგ. 5032fac6-a13b-439b-a297-99f8d818033b</w:t>
+              <w:t xml:space="preserve">მთელი რიცხვი (int), PostgreSQL identity — მაგ. 1</w:t>
             </w:r>
           </w:p>
         </w:tc>
@@ -7801,7 +7801,7 @@
                 <w:sz w:val="17"/>
                 <w:szCs w:val="17"/>
               </w:rPr>
-              <w:t xml:space="preserve">მომხმარებლის UUID</w:t>
+              <w:t xml:space="preserve">მომხმარებლის ID (int, string-ად)</w:t>
             </w:r>
           </w:p>
         </w:tc>
@@ -11908,7 +11908,7 @@
                 <w:sz w:val="15"/>
                 <w:szCs w:val="15"/>
               </w:rPr>
-              <w:t xml:space="preserve">Location: https://localhost:7149/api/v1/user/5032fac6-a13b-439b-a297-99f8d818033b</w:t>
+              <w:t xml:space="preserve">Location: https://localhost:7149/api/v1/user/1</w:t>
             </w:r>
           </w:p>
           <w:p>
@@ -11950,7 +11950,7 @@
                 <w:sz w:val="15"/>
                 <w:szCs w:val="15"/>
               </w:rPr>
-              <w:t xml:space="preserve">  "id": "5032fac6-a13b-439b-a297-99f8d818033b",</w:t>
+              <w:t xml:space="preserve">  "id": "1",</w:t>
             </w:r>
           </w:p>
           <w:p>
@@ -14122,7 +14122,7 @@
                 <w:sz w:val="16"/>
                 <w:szCs w:val="16"/>
               </w:rPr>
-              <w:t xml:space="preserve">id — UUID (მაგ. 5032fac6-a13b-439b-a297-99f8d818033b)</w:t>
+              <w:t xml:space="preserve">id — int (მაგ. 1)</w:t>
             </w:r>
           </w:p>
         </w:tc>
@@ -15621,7 +15621,7 @@
                 <w:sz w:val="15"/>
                 <w:szCs w:val="15"/>
               </w:rPr>
-              <w:t xml:space="preserve">PUT https://localhost:7149/api/v1/user/5032fac6-a13b-439b-a297-99f8d818033b</w:t>
+              <w:t xml:space="preserve">PUT https://localhost:7149/api/v1/user/1</w:t>
             </w:r>
           </w:p>
           <w:p>
@@ -18418,7 +18418,7 @@
                 <w:sz w:val="15"/>
                 <w:szCs w:val="15"/>
               </w:rPr>
-              <w:t xml:space="preserve">Location: https://localhost:7149/api/v1/pet/276d1780-2d83-478e-8b0a-382c62bdc3c3</w:t>
+              <w:t xml:space="preserve">Location: https://localhost:7149/api/v1/pet/1</w:t>
             </w:r>
           </w:p>
           <w:p>
@@ -18460,7 +18460,7 @@
                 <w:sz w:val="15"/>
                 <w:szCs w:val="15"/>
               </w:rPr>
-              <w:t xml:space="preserve">  "id": "276d1780-2d83-478e-8b0a-382c62bdc3c3",</w:t>
+              <w:t xml:space="preserve">  "id": "1",</w:t>
             </w:r>
           </w:p>
           <w:p>
@@ -18474,7 +18474,7 @@
                 <w:sz w:val="15"/>
                 <w:szCs w:val="15"/>
               </w:rPr>
-              <w:t xml:space="preserve">  "ownerId": "28ab4e32-6557-41f5-9b74-1c49735d81ed",</w:t>
+              <w:t xml:space="preserve">  "ownerId": "1",</w:t>
             </w:r>
           </w:p>
           <w:p>
@@ -20723,7 +20723,7 @@
                 <w:sz w:val="16"/>
                 <w:szCs w:val="16"/>
               </w:rPr>
-              <w:t xml:space="preserve">string (uuid)</w:t>
+              <w:t xml:space="preserve">integer</w:t>
             </w:r>
           </w:p>
         </w:tc>
@@ -24740,7 +24740,7 @@
                 <w:sz w:val="16"/>
                 <w:szCs w:val="16"/>
               </w:rPr>
-              <w:t xml:space="preserve">string (uuid)</w:t>
+              <w:t xml:space="preserve">integer</w:t>
             </w:r>
           </w:p>
         </w:tc>
@@ -24851,7 +24851,7 @@
                 <w:sz w:val="16"/>
                 <w:szCs w:val="16"/>
               </w:rPr>
-              <w:t xml:space="preserve">string (uuid)</w:t>
+              <w:t xml:space="preserve">integer</w:t>
             </w:r>
           </w:p>
         </w:tc>

</xml_diff>

<commit_message>
add OTP email verification and password reset
Add hashed 6-digit OTPs with expiry, attempt limits, resend cooldown and send window. Add verify-email, resend-verification, forgot-password and reset-password endpoints, block login until email is verified, and backfill existing users. Replace the one-to-one UserCode model with UserOtpCode and add the migration. Update SMTP/OTP configuration, README and the frontend integration guide.
</commit_message>
<xml_diff>
--- a/docs/HappyPet-Frontend-Integration-Guide.docx
+++ b/docs/HappyPet-Frontend-Integration-Guide.docx
@@ -1858,7 +1858,7 @@
           <w:sz w:val="20"/>
           <w:szCs w:val="20"/>
         </w:rPr>
-        <w:t xml:space="preserve">ეს არის HappyPet backend-ის მიმდინარე მდგომარეობის ასახვა 2026 წლის 23 ოქტომბრისთვის. ყველა მაგალითი რეალურად შემოწმებულია გაშვებულ API-ზე. დოკუმენტი შეცვლისას ან ახალი ფუნქციონალის დამატებისას განახლდება ცვლილებების ისტორია (სექცია 18).</w:t>
+        <w:t>ეს არის HappyPet backend-ის მიმდინარე მდგომარეობის ასახვა 2026 წლის 27 ოქტომბრისთვის. ყველა მაგალითი რეალურად შემოწმებულია გაშვებულ API-ზე. დოკუმენტი შეცვლისას ან ახალი ფუნქციონალის დამატებისას განახლდება ცვლილებების ისტორია (სექცია 18).</w:t>
       </w:r>
     </w:p>
     <w:p>
@@ -2169,13 +2169,7 @@
         <w:spacing w:after="120" w:line="300"/>
       </w:pPr>
       <w:r>
-        <w:rPr>
-          <w:rFonts w:ascii="Segoe UI" w:cs="Segoe UI" w:eastAsia="Segoe UI" w:hAnsi="Segoe UI"/>
-          <w:color w:val="22302B"/>
-          <w:sz w:val="20"/>
-          <w:szCs w:val="20"/>
-        </w:rPr>
-        <w:t xml:space="preserve">დღეს backend-ში მუშაობს მომხმარებლის რეგისტრაცია/პროფილი, ავტორიზაცია (login) და ცხოველების (Pet) სრული CRUD — მფლობელის სიითა და დაკარგული ცხოველების endpoint-ით.</w:t>
+        <w:t>დღეს backend-ში მუშაობს მომხმარებლის რეგისტრაცია/პროფილი, ავტორიზაცია (login), ელ-ფოსტის ვერიფიკაცია და პაროლის აღდგენა OTP-ით, ცხოველების (Pet) სრული CRUD და ცხოველის ფოტოები (S3).</w:t>
       </w:r>
     </w:p>
     <w:tbl>
@@ -2628,84 +2622,33 @@
         </w:tc>
       </w:tr>
       <w:tr>
-        <w:trPr>
-          <w:cantSplit/>
-        </w:trPr>
         <w:tc>
           <w:tcPr>
             <w:tcW w:type="dxa" w:w="3000"/>
-            <w:tcMar>
-              <w:top w:type="dxa" w:w="70"/>
-              <w:left w:type="dxa" w:w="120"/>
-              <w:bottom w:type="dxa" w:w="70"/>
-              <w:right w:type="dxa" w:w="120"/>
-            </w:tcMar>
-            <w:vAlign w:val="top"/>
-          </w:tcPr>
-          <w:p>
-            <w:pPr>
-              <w:spacing w:after="0" w:line="260"/>
-            </w:pPr>
-            <w:r>
-              <w:rPr>
-                <w:rFonts w:ascii="Segoe UI" w:cs="Segoe UI" w:eastAsia="Segoe UI" w:hAnsi="Segoe UI"/>
-                <w:color w:val="22302B"/>
-                <w:sz w:val="17"/>
-                <w:szCs w:val="17"/>
-              </w:rPr>
-              <w:t xml:space="preserve">ცხოველების სია მფლობელის მიხედვით</w:t>
+          </w:tcPr>
+          <w:p>
+            <w:r>
+              <w:t>ცხოველის ფოტოები</w:t>
             </w:r>
           </w:p>
         </w:tc>
         <w:tc>
           <w:tcPr>
             <w:tcW w:type="dxa" w:w="2300"/>
-            <w:tcMar>
-              <w:top w:type="dxa" w:w="70"/>
-              <w:left w:type="dxa" w:w="120"/>
-              <w:bottom w:type="dxa" w:w="70"/>
-              <w:right w:type="dxa" w:w="120"/>
-            </w:tcMar>
-            <w:vAlign w:val="top"/>
-          </w:tcPr>
-          <w:p>
-            <w:pPr>
-              <w:spacing w:after="0" w:line="260"/>
-            </w:pPr>
-            <w:r>
-              <w:rPr>
-                <w:rFonts w:ascii="Segoe UI" w:cs="Segoe UI" w:eastAsia="Segoe UI" w:hAnsi="Segoe UI"/>
-                <w:color w:val="22302B"/>
-                <w:sz w:val="17"/>
-                <w:szCs w:val="17"/>
-              </w:rPr>
-              <w:t xml:space="preserve">მუშაობს</w:t>
+          </w:tcPr>
+          <w:p>
+            <w:r>
+              <w:t>მუშაობს</w:t>
             </w:r>
           </w:p>
         </w:tc>
         <w:tc>
           <w:tcPr>
             <w:tcW w:type="dxa" w:w="4300"/>
-            <w:tcMar>
-              <w:top w:type="dxa" w:w="70"/>
-              <w:left w:type="dxa" w:w="120"/>
-              <w:bottom w:type="dxa" w:w="70"/>
-              <w:right w:type="dxa" w:w="120"/>
-            </w:tcMar>
-            <w:vAlign w:val="top"/>
-          </w:tcPr>
-          <w:p>
-            <w:pPr>
-              <w:spacing w:after="0" w:line="260"/>
-            </w:pPr>
-            <w:r>
-              <w:rPr>
-                <w:rFonts w:ascii="Segoe UI" w:cs="Segoe UI" w:eastAsia="Segoe UI" w:hAnsi="Segoe UI"/>
-                <w:color w:val="22302B"/>
-                <w:sz w:val="17"/>
-                <w:szCs w:val="17"/>
-              </w:rPr>
-              <w:t xml:space="preserve">GET /pet/owner/{ownerId}</w:t>
+          </w:tcPr>
+          <w:p>
+            <w:r>
+              <w:t>S3 ატვირთვა; max 5 MB, 10 ფოტო</w:t>
             </w:r>
           </w:p>
         </w:tc>
@@ -2717,34 +2660,32 @@
         <w:tc>
           <w:tcPr>
             <w:tcW w:type="dxa" w:w="3000"/>
-            <w:shd w:fill="F4F8F6" w:val="clear"/>
-            <w:tcMar>
-              <w:top w:type="dxa" w:w="70"/>
-              <w:left w:type="dxa" w:w="120"/>
-              <w:bottom w:type="dxa" w:w="70"/>
-              <w:right w:type="dxa" w:w="120"/>
-            </w:tcMar>
-            <w:vAlign w:val="top"/>
-          </w:tcPr>
-          <w:p>
-            <w:pPr>
-              <w:spacing w:after="0" w:line="260"/>
-            </w:pPr>
-            <w:r>
-              <w:rPr>
-                <w:rFonts w:ascii="Segoe UI" w:cs="Segoe UI" w:eastAsia="Segoe UI" w:hAnsi="Segoe UI"/>
-                <w:color w:val="22302B"/>
-                <w:sz w:val="17"/>
-                <w:szCs w:val="17"/>
-              </w:rPr>
-              <w:t xml:space="preserve">დაკარგული ცხოველების სია</w:t>
+            <w:tcMar>
+              <w:top w:type="dxa" w:w="70"/>
+              <w:left w:type="dxa" w:w="120"/>
+              <w:bottom w:type="dxa" w:w="70"/>
+              <w:right w:type="dxa" w:w="120"/>
+            </w:tcMar>
+            <w:vAlign w:val="top"/>
+          </w:tcPr>
+          <w:p>
+            <w:pPr>
+              <w:spacing w:after="0" w:line="260"/>
+            </w:pPr>
+            <w:r>
+              <w:rPr>
+                <w:rFonts w:ascii="Segoe UI" w:cs="Segoe UI" w:eastAsia="Segoe UI" w:hAnsi="Segoe UI"/>
+                <w:color w:val="22302B"/>
+                <w:sz w:val="17"/>
+                <w:szCs w:val="17"/>
+              </w:rPr>
+              <w:t xml:space="preserve">ცხოველების სია მფლობელის მიხედვით</w:t>
             </w:r>
           </w:p>
         </w:tc>
         <w:tc>
           <w:tcPr>
             <w:tcW w:type="dxa" w:w="2300"/>
-            <w:shd w:fill="F4F8F6" w:val="clear"/>
             <w:tcMar>
               <w:top w:type="dxa" w:w="70"/>
               <w:left w:type="dxa" w:w="120"/>
@@ -2771,27 +2712,26 @@
         <w:tc>
           <w:tcPr>
             <w:tcW w:type="dxa" w:w="4300"/>
-            <w:shd w:fill="F4F8F6" w:val="clear"/>
-            <w:tcMar>
-              <w:top w:type="dxa" w:w="70"/>
-              <w:left w:type="dxa" w:w="120"/>
-              <w:bottom w:type="dxa" w:w="70"/>
-              <w:right w:type="dxa" w:w="120"/>
-            </w:tcMar>
-            <w:vAlign w:val="top"/>
-          </w:tcPr>
-          <w:p>
-            <w:pPr>
-              <w:spacing w:after="0" w:line="260"/>
-            </w:pPr>
-            <w:r>
-              <w:rPr>
-                <w:rFonts w:ascii="Segoe UI" w:cs="Segoe UI" w:eastAsia="Segoe UI" w:hAnsi="Segoe UI"/>
-                <w:color w:val="22302B"/>
-                <w:sz w:val="17"/>
-                <w:szCs w:val="17"/>
-              </w:rPr>
-              <w:t xml:space="preserve">GET /pet/lost</w:t>
+            <w:tcMar>
+              <w:top w:type="dxa" w:w="70"/>
+              <w:left w:type="dxa" w:w="120"/>
+              <w:bottom w:type="dxa" w:w="70"/>
+              <w:right w:type="dxa" w:w="120"/>
+            </w:tcMar>
+            <w:vAlign w:val="top"/>
+          </w:tcPr>
+          <w:p>
+            <w:pPr>
+              <w:spacing w:after="0" w:line="260"/>
+            </w:pPr>
+            <w:r>
+              <w:rPr>
+                <w:rFonts w:ascii="Segoe UI" w:cs="Segoe UI" w:eastAsia="Segoe UI" w:hAnsi="Segoe UI"/>
+                <w:color w:val="22302B"/>
+                <w:sz w:val="17"/>
+                <w:szCs w:val="17"/>
+              </w:rPr>
+              <w:t xml:space="preserve">GET /pet/owner/{ownerId}</w:t>
             </w:r>
           </w:p>
         </w:tc>
@@ -2803,78 +2743,81 @@
         <w:tc>
           <w:tcPr>
             <w:tcW w:type="dxa" w:w="3000"/>
-            <w:tcMar>
-              <w:top w:type="dxa" w:w="70"/>
-              <w:left w:type="dxa" w:w="120"/>
-              <w:bottom w:type="dxa" w:w="70"/>
-              <w:right w:type="dxa" w:w="120"/>
-            </w:tcMar>
-            <w:vAlign w:val="top"/>
-          </w:tcPr>
-          <w:p>
-            <w:pPr>
-              <w:spacing w:after="0" w:line="260"/>
-            </w:pPr>
-            <w:r>
-              <w:rPr>
-                <w:rFonts w:ascii="Segoe UI" w:cs="Segoe UI" w:eastAsia="Segoe UI" w:hAnsi="Segoe UI"/>
-                <w:color w:val="22302B"/>
-                <w:sz w:val="17"/>
-                <w:szCs w:val="17"/>
-              </w:rPr>
-              <w:t xml:space="preserve">ავატარის ატვირთვა</w:t>
+            <w:shd w:fill="F4F8F6" w:val="clear"/>
+            <w:tcMar>
+              <w:top w:type="dxa" w:w="70"/>
+              <w:left w:type="dxa" w:w="120"/>
+              <w:bottom w:type="dxa" w:w="70"/>
+              <w:right w:type="dxa" w:w="120"/>
+            </w:tcMar>
+            <w:vAlign w:val="top"/>
+          </w:tcPr>
+          <w:p>
+            <w:pPr>
+              <w:spacing w:after="0" w:line="260"/>
+            </w:pPr>
+            <w:r>
+              <w:rPr>
+                <w:rFonts w:ascii="Segoe UI" w:cs="Segoe UI" w:eastAsia="Segoe UI" w:hAnsi="Segoe UI"/>
+                <w:color w:val="22302B"/>
+                <w:sz w:val="17"/>
+                <w:szCs w:val="17"/>
+              </w:rPr>
+              <w:t xml:space="preserve">დაკარგული ცხოველების სია</w:t>
             </w:r>
           </w:p>
         </w:tc>
         <w:tc>
           <w:tcPr>
             <w:tcW w:type="dxa" w:w="2300"/>
-            <w:tcMar>
-              <w:top w:type="dxa" w:w="70"/>
-              <w:left w:type="dxa" w:w="120"/>
-              <w:bottom w:type="dxa" w:w="70"/>
-              <w:right w:type="dxa" w:w="120"/>
-            </w:tcMar>
-            <w:vAlign w:val="top"/>
-          </w:tcPr>
-          <w:p>
-            <w:pPr>
-              <w:spacing w:after="0" w:line="260"/>
-            </w:pPr>
-            <w:r>
-              <w:rPr>
-                <w:rFonts w:ascii="Segoe UI" w:cs="Segoe UI" w:eastAsia="Segoe UI" w:hAnsi="Segoe UI"/>
-                <w:color w:val="22302B"/>
-                <w:sz w:val="17"/>
-                <w:szCs w:val="17"/>
-              </w:rPr>
-              <w:t xml:space="preserve">არ არსებობს</w:t>
+            <w:shd w:fill="F4F8F6" w:val="clear"/>
+            <w:tcMar>
+              <w:top w:type="dxa" w:w="70"/>
+              <w:left w:type="dxa" w:w="120"/>
+              <w:bottom w:type="dxa" w:w="70"/>
+              <w:right w:type="dxa" w:w="120"/>
+            </w:tcMar>
+            <w:vAlign w:val="top"/>
+          </w:tcPr>
+          <w:p>
+            <w:pPr>
+              <w:spacing w:after="0" w:line="260"/>
+            </w:pPr>
+            <w:r>
+              <w:rPr>
+                <w:rFonts w:ascii="Segoe UI" w:cs="Segoe UI" w:eastAsia="Segoe UI" w:hAnsi="Segoe UI"/>
+                <w:color w:val="22302B"/>
+                <w:sz w:val="17"/>
+                <w:szCs w:val="17"/>
+              </w:rPr>
+              <w:t xml:space="preserve">მუშაობს</w:t>
             </w:r>
           </w:p>
         </w:tc>
         <w:tc>
           <w:tcPr>
             <w:tcW w:type="dxa" w:w="4300"/>
-            <w:tcMar>
-              <w:top w:type="dxa" w:w="70"/>
-              <w:left w:type="dxa" w:w="120"/>
-              <w:bottom w:type="dxa" w:w="70"/>
-              <w:right w:type="dxa" w:w="120"/>
-            </w:tcMar>
-            <w:vAlign w:val="top"/>
-          </w:tcPr>
-          <w:p>
-            <w:pPr>
-              <w:spacing w:after="0" w:line="260"/>
-            </w:pPr>
-            <w:r>
-              <w:rPr>
-                <w:rFonts w:ascii="Segoe UI" w:cs="Segoe UI" w:eastAsia="Segoe UI" w:hAnsi="Segoe UI"/>
-                <w:color w:val="22302B"/>
-                <w:sz w:val="17"/>
-                <w:szCs w:val="17"/>
-              </w:rPr>
-              <w:t xml:space="preserve">ProfileImageUrl ყოველთვის null</w:t>
+            <w:shd w:fill="F4F8F6" w:val="clear"/>
+            <w:tcMar>
+              <w:top w:type="dxa" w:w="70"/>
+              <w:left w:type="dxa" w:w="120"/>
+              <w:bottom w:type="dxa" w:w="70"/>
+              <w:right w:type="dxa" w:w="120"/>
+            </w:tcMar>
+            <w:vAlign w:val="top"/>
+          </w:tcPr>
+          <w:p>
+            <w:pPr>
+              <w:spacing w:after="0" w:line="260"/>
+            </w:pPr>
+            <w:r>
+              <w:rPr>
+                <w:rFonts w:ascii="Segoe UI" w:cs="Segoe UI" w:eastAsia="Segoe UI" w:hAnsi="Segoe UI"/>
+                <w:color w:val="22302B"/>
+                <w:sz w:val="17"/>
+                <w:szCs w:val="17"/>
+              </w:rPr>
+              <w:t xml:space="preserve">GET /pet/lost</w:t>
             </w:r>
           </w:p>
         </w:tc>
@@ -2886,34 +2829,32 @@
         <w:tc>
           <w:tcPr>
             <w:tcW w:type="dxa" w:w="3000"/>
-            <w:shd w:fill="F4F8F6" w:val="clear"/>
-            <w:tcMar>
-              <w:top w:type="dxa" w:w="70"/>
-              <w:left w:type="dxa" w:w="120"/>
-              <w:bottom w:type="dxa" w:w="70"/>
-              <w:right w:type="dxa" w:w="120"/>
-            </w:tcMar>
-            <w:vAlign w:val="top"/>
-          </w:tcPr>
-          <w:p>
-            <w:pPr>
-              <w:spacing w:after="0" w:line="260"/>
-            </w:pPr>
-            <w:r>
-              <w:rPr>
-                <w:rFonts w:ascii="Segoe UI" w:cs="Segoe UI" w:eastAsia="Segoe UI" w:hAnsi="Segoe UI"/>
-                <w:color w:val="22302B"/>
-                <w:sz w:val="17"/>
-                <w:szCs w:val="17"/>
-              </w:rPr>
-              <w:t xml:space="preserve">ელ-ფოსტის ვერიფიკაცია</w:t>
+            <w:tcMar>
+              <w:top w:type="dxa" w:w="70"/>
+              <w:left w:type="dxa" w:w="120"/>
+              <w:bottom w:type="dxa" w:w="70"/>
+              <w:right w:type="dxa" w:w="120"/>
+            </w:tcMar>
+            <w:vAlign w:val="top"/>
+          </w:tcPr>
+          <w:p>
+            <w:pPr>
+              <w:spacing w:after="0" w:line="260"/>
+            </w:pPr>
+            <w:r>
+              <w:rPr>
+                <w:rFonts w:ascii="Segoe UI" w:cs="Segoe UI" w:eastAsia="Segoe UI" w:hAnsi="Segoe UI"/>
+                <w:color w:val="22302B"/>
+                <w:sz w:val="17"/>
+                <w:szCs w:val="17"/>
+              </w:rPr>
+              <w:t xml:space="preserve">ავატარის ატვირთვა</w:t>
             </w:r>
           </w:p>
         </w:tc>
         <w:tc>
           <w:tcPr>
             <w:tcW w:type="dxa" w:w="2300"/>
-            <w:shd w:fill="F4F8F6" w:val="clear"/>
             <w:tcMar>
               <w:top w:type="dxa" w:w="70"/>
               <w:left w:type="dxa" w:w="120"/>
@@ -2940,27 +2881,26 @@
         <w:tc>
           <w:tcPr>
             <w:tcW w:type="dxa" w:w="4300"/>
-            <w:shd w:fill="F4F8F6" w:val="clear"/>
-            <w:tcMar>
-              <w:top w:type="dxa" w:w="70"/>
-              <w:left w:type="dxa" w:w="120"/>
-              <w:bottom w:type="dxa" w:w="70"/>
-              <w:right w:type="dxa" w:w="120"/>
-            </w:tcMar>
-            <w:vAlign w:val="top"/>
-          </w:tcPr>
-          <w:p>
-            <w:pPr>
-              <w:spacing w:after="0" w:line="260"/>
-            </w:pPr>
-            <w:r>
-              <w:rPr>
-                <w:rFonts w:ascii="Segoe UI" w:cs="Segoe UI" w:eastAsia="Segoe UI" w:hAnsi="Segoe UI"/>
-                <w:color w:val="22302B"/>
-                <w:sz w:val="17"/>
-                <w:szCs w:val="17"/>
-              </w:rPr>
-              <w:t xml:space="preserve">IsVerified ყოველთვის false</w:t>
+            <w:tcMar>
+              <w:top w:type="dxa" w:w="70"/>
+              <w:left w:type="dxa" w:w="120"/>
+              <w:bottom w:type="dxa" w:w="70"/>
+              <w:right w:type="dxa" w:w="120"/>
+            </w:tcMar>
+            <w:vAlign w:val="top"/>
+          </w:tcPr>
+          <w:p>
+            <w:pPr>
+              <w:spacing w:after="0" w:line="260"/>
+            </w:pPr>
+            <w:r>
+              <w:rPr>
+                <w:rFonts w:ascii="Segoe UI" w:cs="Segoe UI" w:eastAsia="Segoe UI" w:hAnsi="Segoe UI"/>
+                <w:color w:val="22302B"/>
+                <w:sz w:val="17"/>
+                <w:szCs w:val="17"/>
+              </w:rPr>
+              <w:t xml:space="preserve">ProfileImageUrl ყოველთვის null</w:t>
             </w:r>
           </w:p>
         </w:tc>
@@ -2972,78 +2912,110 @@
         <w:tc>
           <w:tcPr>
             <w:tcW w:type="dxa" w:w="3000"/>
-            <w:tcMar>
-              <w:top w:type="dxa" w:w="70"/>
-              <w:left w:type="dxa" w:w="120"/>
-              <w:bottom w:type="dxa" w:w="70"/>
-              <w:right w:type="dxa" w:w="120"/>
-            </w:tcMar>
-            <w:vAlign w:val="top"/>
-          </w:tcPr>
-          <w:p>
-            <w:pPr>
-              <w:spacing w:after="0" w:line="260"/>
-            </w:pPr>
-            <w:r>
-              <w:rPr>
-                <w:rFonts w:ascii="Segoe UI" w:cs="Segoe UI" w:eastAsia="Segoe UI" w:hAnsi="Segoe UI"/>
-                <w:color w:val="22302B"/>
-                <w:sz w:val="17"/>
-                <w:szCs w:val="17"/>
-              </w:rPr>
-              <w:t xml:space="preserve">პაროლის აღდგენა</w:t>
+            <w:shd w:fill="F4F8F6" w:val="clear"/>
+            <w:tcMar>
+              <w:top w:type="dxa" w:w="70"/>
+              <w:left w:type="dxa" w:w="120"/>
+              <w:bottom w:type="dxa" w:w="70"/>
+              <w:right w:type="dxa" w:w="120"/>
+            </w:tcMar>
+            <w:vAlign w:val="top"/>
+          </w:tcPr>
+          <w:p>
+            <w:r>
+              <w:t>ელ-ფოსტის ვერიფიკაცია</w:t>
             </w:r>
           </w:p>
         </w:tc>
         <w:tc>
           <w:tcPr>
             <w:tcW w:type="dxa" w:w="2300"/>
-            <w:tcMar>
-              <w:top w:type="dxa" w:w="70"/>
-              <w:left w:type="dxa" w:w="120"/>
-              <w:bottom w:type="dxa" w:w="70"/>
-              <w:right w:type="dxa" w:w="120"/>
-            </w:tcMar>
-            <w:vAlign w:val="top"/>
-          </w:tcPr>
-          <w:p>
-            <w:pPr>
-              <w:spacing w:after="0" w:line="260"/>
-            </w:pPr>
-            <w:r>
-              <w:rPr>
-                <w:rFonts w:ascii="Segoe UI" w:cs="Segoe UI" w:eastAsia="Segoe UI" w:hAnsi="Segoe UI"/>
-                <w:color w:val="22302B"/>
-                <w:sz w:val="17"/>
-                <w:szCs w:val="17"/>
-              </w:rPr>
-              <w:t xml:space="preserve">არ არსებობს</w:t>
+            <w:shd w:fill="F4F8F6" w:val="clear"/>
+            <w:tcMar>
+              <w:top w:type="dxa" w:w="70"/>
+              <w:left w:type="dxa" w:w="120"/>
+              <w:bottom w:type="dxa" w:w="70"/>
+              <w:right w:type="dxa" w:w="120"/>
+            </w:tcMar>
+            <w:vAlign w:val="top"/>
+          </w:tcPr>
+          <w:p>
+            <w:r>
+              <w:t>მუშაობს</w:t>
             </w:r>
           </w:p>
         </w:tc>
         <w:tc>
           <w:tcPr>
             <w:tcW w:type="dxa" w:w="4300"/>
-            <w:tcMar>
-              <w:top w:type="dxa" w:w="70"/>
-              <w:left w:type="dxa" w:w="120"/>
-              <w:bottom w:type="dxa" w:w="70"/>
-              <w:right w:type="dxa" w:w="120"/>
-            </w:tcMar>
-            <w:vAlign w:val="top"/>
-          </w:tcPr>
-          <w:p>
-            <w:pPr>
-              <w:spacing w:after="0" w:line="260"/>
-            </w:pPr>
-            <w:r>
-              <w:rPr>
-                <w:rFonts w:ascii="Segoe UI" w:cs="Segoe UI" w:eastAsia="Segoe UI" w:hAnsi="Segoe UI"/>
-                <w:color w:val="22302B"/>
-                <w:sz w:val="17"/>
-                <w:szCs w:val="17"/>
-              </w:rPr>
-              <w:t xml:space="preserve">არ დაგეგმო UI ჯერ</w:t>
+            <w:shd w:fill="F4F8F6" w:val="clear"/>
+            <w:tcMar>
+              <w:top w:type="dxa" w:w="70"/>
+              <w:left w:type="dxa" w:w="120"/>
+              <w:bottom w:type="dxa" w:w="70"/>
+              <w:right w:type="dxa" w:w="120"/>
+            </w:tcMar>
+            <w:vAlign w:val="top"/>
+          </w:tcPr>
+          <w:p>
+            <w:r>
+              <w:t>6-ციფრიანი OTP; login დაბლოკილია ვერიფიკაციამდე</w:t>
+            </w:r>
+          </w:p>
+        </w:tc>
+      </w:tr>
+      <w:tr>
+        <w:trPr>
+          <w:cantSplit/>
+        </w:trPr>
+        <w:tc>
+          <w:tcPr>
+            <w:tcW w:type="dxa" w:w="3000"/>
+            <w:tcMar>
+              <w:top w:type="dxa" w:w="70"/>
+              <w:left w:type="dxa" w:w="120"/>
+              <w:bottom w:type="dxa" w:w="70"/>
+              <w:right w:type="dxa" w:w="120"/>
+            </w:tcMar>
+            <w:vAlign w:val="top"/>
+          </w:tcPr>
+          <w:p>
+            <w:r>
+              <w:t>პაროლის აღდგენა</w:t>
+            </w:r>
+          </w:p>
+        </w:tc>
+        <w:tc>
+          <w:tcPr>
+            <w:tcW w:type="dxa" w:w="2300"/>
+            <w:tcMar>
+              <w:top w:type="dxa" w:w="70"/>
+              <w:left w:type="dxa" w:w="120"/>
+              <w:bottom w:type="dxa" w:w="70"/>
+              <w:right w:type="dxa" w:w="120"/>
+            </w:tcMar>
+            <w:vAlign w:val="top"/>
+          </w:tcPr>
+          <w:p>
+            <w:r>
+              <w:t>მუშაობს</w:t>
+            </w:r>
+          </w:p>
+        </w:tc>
+        <w:tc>
+          <w:tcPr>
+            <w:tcW w:type="dxa" w:w="4300"/>
+            <w:tcMar>
+              <w:top w:type="dxa" w:w="70"/>
+              <w:left w:type="dxa" w:w="120"/>
+              <w:bottom w:type="dxa" w:w="70"/>
+              <w:right w:type="dxa" w:w="120"/>
+            </w:tcMar>
+            <w:vAlign w:val="top"/>
+          </w:tcPr>
+          <w:p>
+            <w:r>
+              <w:t>OTP-ით; დროებითი პაროლი არ იგზავნება</w:t>
             </w:r>
           </w:p>
         </w:tc>
@@ -4686,6 +4658,28 @@
                 <w:szCs w:val="16"/>
               </w:rPr>
               <w:t xml:space="preserve">კონფიგურირებულია: localhost:3000 და localhost:5173</w:t>
+            </w:r>
+          </w:p>
+        </w:tc>
+      </w:tr>
+      <w:tr>
+        <w:tc>
+          <w:tcPr>
+            <w:tcW w:type="dxa" w:w="2300"/>
+          </w:tcPr>
+          <w:p>
+            <w:r>
+              <w:t>Email</w:t>
+            </w:r>
+          </w:p>
+        </w:tc>
+        <w:tc>
+          <w:tcPr>
+            <w:tcW w:type="dxa" w:w="7300"/>
+          </w:tcPr>
+          <w:p>
+            <w:r>
+              <w:t>SMTP + 6-ციფრიანი OTP</w:t>
             </w:r>
           </w:p>
         </w:tc>
@@ -4928,13 +4922,7 @@
         <w:spacing w:after="80" w:line="280"/>
       </w:pPr>
       <w:r>
-        <w:rPr>
-          <w:rFonts w:ascii="Segoe UI" w:cs="Segoe UI" w:eastAsia="Segoe UI" w:hAnsi="Segoe UI"/>
-          <w:color w:val="22302B"/>
-          <w:sz w:val="20"/>
-          <w:szCs w:val="20"/>
-        </w:rPr>
-        <w:t xml:space="preserve">დარწმუნდი, რომ src/HappyPet.WebAPI/appsettings.json არსებობს. ეს ფაილი git-ში არ ინახება, ამიტომ ახალ clone-ში შეიძლება არ იყოს.</w:t>
+        <w:t>დარწმუნდი, რომ src/HappyPet.WebAPI/appsettings.json (ან appsettings.Development.json) არსებობს. ეს ფაილები git-ში არ ინახება, ამიტომ ახალ clone-ში შეიძლება არ იყოს.</w:t>
       </w:r>
     </w:p>
     <w:tbl>
@@ -5167,6 +5155,12 @@
         </w:tc>
       </w:tr>
     </w:tbl>
+    <w:p>
+      <w:pPr/>
+      <w:r>
+        <w:t>Email/Otp კონფიგურაცია: Email:SmtpHost, Email:SmtpPort, Email:EnableSsl, Email:From, Email:SmtpUser, Email:SmtpPassword და Otp:HashKey (მინიმუმ 32 სიმბოლო). რეგისტრაციისა და პაროლის აღდგენის OTP ამ პარამეტრების გარეშე არ გაიგზავნება.</w:t>
+      </w:r>
+    </w:p>
     <w:p>
       <w:pPr>
         <w:pStyle w:val="ListParagraph"/>
@@ -6842,17 +6836,8 @@
             <w:vAlign w:val="top"/>
           </w:tcPr>
           <w:p>
-            <w:pPr>
-              <w:spacing w:after="0" w:line="260"/>
-            </w:pPr>
-            <w:r>
-              <w:rPr>
-                <w:rFonts w:ascii="Segoe UI" w:cs="Segoe UI" w:eastAsia="Segoe UI" w:hAnsi="Segoe UI"/>
-                <w:color w:val="22302B"/>
-                <w:sz w:val="17"/>
-                <w:szCs w:val="17"/>
-              </w:rPr>
-              <w:t xml:space="preserve">Authorization: Bearer &lt;token&gt; — სავალდებულოა register/login-ის გარდა</w:t>
+            <w:r>
+              <w:t>Authorization: Bearer &lt;token&gt; — სავალდებულოა register/login/verify-email/resend-verification/forgot-password/reset-password-ის გარდა</w:t>
             </w:r>
           </w:p>
         </w:tc>
@@ -6958,17 +6943,8 @@
             <w:vAlign w:val="top"/>
           </w:tcPr>
           <w:p>
-            <w:pPr>
-              <w:spacing w:after="0" w:line="260"/>
-            </w:pPr>
-            <w:r>
-              <w:rPr>
-                <w:rFonts w:ascii="Segoe UI" w:cs="Segoe UI" w:eastAsia="Segoe UI" w:hAnsi="Segoe UI"/>
-                <w:color w:val="22302B"/>
-                <w:sz w:val="17"/>
-                <w:szCs w:val="17"/>
-              </w:rPr>
-              <w:t xml:space="preserve">არ არსებობს</w:t>
+            <w:r>
+              <w:t>OTP: 3 გაგზავნა/15 წთ, 60 წმ cooldown; login-ზე rate limiting არ არსებობს</w:t>
             </w:r>
           </w:p>
         </w:tc>
@@ -7246,13 +7222,7 @@
         <w:spacing w:after="80" w:line="280"/>
       </w:pPr>
       <w:r>
-        <w:rPr>
-          <w:rFonts w:ascii="Segoe UI" w:cs="Segoe UI" w:eastAsia="Segoe UI" w:hAnsi="Segoe UI"/>
-          <w:color w:val="22302B"/>
-          <w:sz w:val="20"/>
-          <w:szCs w:val="20"/>
-        </w:rPr>
-        <w:t xml:space="preserve">მომხმარებელი ავსებს რეგისტრაციის ფორმას → POST /api/v1/user/add-user.</w:t>
+        <w:t>მომხმარებელი ავსებს რეგისტრაციის ფორმას → POST /api/v1/user/add-user.</w:t>
       </w:r>
     </w:p>
     <w:p>
@@ -7265,13 +7235,7 @@
         <w:spacing w:after="80" w:line="280"/>
       </w:pPr>
       <w:r>
-        <w:rPr>
-          <w:rFonts w:ascii="Segoe UI" w:cs="Segoe UI" w:eastAsia="Segoe UI" w:hAnsi="Segoe UI"/>
-          <w:color w:val="22302B"/>
-          <w:sz w:val="20"/>
-          <w:szCs w:val="20"/>
-        </w:rPr>
-        <w:t xml:space="preserve">backend ქმნის User-ს, აბრუნებს 201 + UserResponse-ს. ტოკენი აქ არ ბრუნდება.</w:t>
+        <w:t>backend ქმნის User-ს isEmailVerified=false-ით, აგზავნის 6-ციფრიან OTP-ს ელ-ფოსტაზე და აბრუნებს 201 + UserResponse-ს. ტოკენი აქ არ ბრუნდება.</w:t>
       </w:r>
     </w:p>
     <w:p>
@@ -7284,13 +7248,7 @@
         <w:spacing w:after="80" w:line="280"/>
       </w:pPr>
       <w:r>
-        <w:rPr>
-          <w:rFonts w:ascii="Segoe UI" w:cs="Segoe UI" w:eastAsia="Segoe UI" w:hAnsi="Segoe UI"/>
-          <w:color w:val="22302B"/>
-          <w:sz w:val="20"/>
-          <w:szCs w:val="20"/>
-        </w:rPr>
-        <w:t xml:space="preserve">frontend ავტომატურად აგზავნის login request-ს → POST /api/v1/auth/login.</w:t>
+        <w:t>frontend გადადის /verify-email ეკრანზე; მომხმარებელი შეიყვანს email-ზე მიღებულ 6-ციფრიან კოდს → POST /api/v1/auth/verify-email.</w:t>
       </w:r>
     </w:p>
     <w:p>
@@ -7303,13 +7261,7 @@
         <w:spacing w:after="80" w:line="280"/>
       </w:pPr>
       <w:r>
-        <w:rPr>
-          <w:rFonts w:ascii="Segoe UI" w:cs="Segoe UI" w:eastAsia="Segoe UI" w:hAnsi="Segoe UI"/>
-          <w:color w:val="22302B"/>
-          <w:sz w:val="20"/>
-          <w:szCs w:val="20"/>
-        </w:rPr>
-        <w:t xml:space="preserve">backend ამოწმებს პაროლს და აბრუნებს LoginResponse-ს, რომელშიც არის JWT.</w:t>
+        <w:t>ვერიფიკაციის შემდეგ frontend აგზავნის login request-ს → POST /api/v1/auth/login; backend აბრუნებს LoginResponse-ს JWT-ით.</w:t>
       </w:r>
     </w:p>
     <w:p>
@@ -7341,13 +7293,7 @@
         <w:spacing w:after="80" w:line="280"/>
       </w:pPr>
       <w:r>
-        <w:rPr>
-          <w:rFonts w:ascii="Segoe UI" w:cs="Segoe UI" w:eastAsia="Segoe UI" w:hAnsi="Segoe UI"/>
-          <w:color w:val="22302B"/>
-          <w:sz w:val="20"/>
-          <w:szCs w:val="20"/>
-        </w:rPr>
-        <w:t xml:space="preserve">401-ის ან token expiry-ს შემთხვევაში ასუფთავებს session-ს და აბრუნებს მომხმარებელს /login-ზე.</w:t>
+        <w:t>401-ის ან token expiry-ს შემთხვევაში ასუფთავებს session-ს და აბრუნებს მომხმარებელს /login-ზე. 403 EMAIL_NOT_VERIFIED-ის შემთხვევაში — /verify-email-ზე.</w:t>
       </w:r>
     </w:p>
     <w:p>
@@ -8362,6 +8308,92 @@
     </w:tbl>
     <w:p>
       <w:pPr>
+        <w:pStyle w:val="Heading2"/>
+      </w:pPr>
+      <w:r>
+        <w:t>6.4 ელ-ფოსტის ვერიფიკაცია და პაროლის აღდგენა (OTP)</w:t>
+      </w:r>
+    </w:p>
+    <w:p>
+      <w:pPr/>
+      <w:r>
+        <w:t>რეგისტრაციისას ანგარიში იქმნება isEmailVerified=false-ით. login დაბლოკილია, სანამ ელ-ფოსტა არ დადასტურდება. OTP არასდროს ბრუნდება API-ის პასუხში და არ იწერება log-ში; ბაზაში ინახება მხოლოდ HMAC-SHA256 ჰეში.</w:t>
+      </w:r>
+    </w:p>
+    <w:p>
+      <w:pPr>
+        <w:pStyle w:val="ListParagraph"/>
+      </w:pPr>
+      <w:r>
+        <w:t>რეგისტრაცია → 6-ციფრიანი კოდი ელ-ფოსტაზე (მოქმედებს 15 წუთი).</w:t>
+      </w:r>
+    </w:p>
+    <w:p>
+      <w:pPr>
+        <w:pStyle w:val="ListParagraph"/>
+      </w:pPr>
+      <w:r>
+        <w:t>verify-email: email + code; წარმატების შემდეგ login შესაძლებელია.</w:t>
+      </w:r>
+    </w:p>
+    <w:p>
+      <w:pPr>
+        <w:pStyle w:val="ListParagraph"/>
+      </w:pPr>
+      <w:r>
+        <w:t>resend-verification: ახალი კოდი; 60 წამის cooldown და 3 გაგზავნა 15 წუთში.</w:t>
+      </w:r>
+    </w:p>
+    <w:p>
+      <w:pPr>
+        <w:pStyle w:val="ListParagraph"/>
+      </w:pPr>
+      <w:r>
+        <w:t>forgot-password: აგზავნის 10-წუთიან კოდს; დროებითი პაროლი არ იგზავნება.</w:t>
+      </w:r>
+    </w:p>
+    <w:p>
+      <w:pPr>
+        <w:pStyle w:val="ListParagraph"/>
+      </w:pPr>
+      <w:r>
+        <w:t>reset-password: email + code + newPassword (მინიმუმ 6 სიმბოლო).</w:t>
+      </w:r>
+    </w:p>
+    <w:p>
+      <w:pPr>
+        <w:pStyle w:val="ListParagraph"/>
+      </w:pPr>
+      <w:r>
+        <w:t>მაქსიმუმ 5 მცდელობა; არასწორი ან ვადაგასული კოდი → 400.</w:t>
+      </w:r>
+    </w:p>
+    <w:p>
+      <w:pPr>
+        <w:pStyle w:val="ListParagraph"/>
+      </w:pPr>
+      <w:r>
+        <w:t>resend-verification და forgot-password ყოველთვის აბრუნებენ generic 200-ს და არ ამჟღავნებენ ანგარიშის არსებობას.</w:t>
+      </w:r>
+    </w:p>
+    <w:p>
+      <w:pPr>
+        <w:pStyle w:val="ListParagraph"/>
+      </w:pPr>
+      <w:r>
+        <w:t>unverified login → 403 { code: "EMAIL_NOT_VERIFIED" }.</w:t>
+      </w:r>
+    </w:p>
+    <w:p>
+      <w:pPr>
+        <w:pStyle w:val="ListParagraph"/>
+      </w:pPr>
+      <w:r>
+        <w:t>მაგალითი: POST /api/v1/auth/verify-email  { "email": "nika@example.com", "code": "123456" }</w:t>
+      </w:r>
+    </w:p>
+    <w:p>
+      <w:pPr>
         <w:pStyle w:val="Heading1"/>
         <w:spacing w:after="200" w:before="360"/>
       </w:pPr>
@@ -8630,17 +8662,8 @@
             <w:vAlign w:val="top"/>
           </w:tcPr>
           <w:p>
-            <w:pPr>
-              <w:spacing w:after="0" w:line="260"/>
-            </w:pPr>
-            <w:r>
-              <w:rPr>
-                <w:rFonts w:ascii="Segoe UI" w:cs="Segoe UI" w:eastAsia="Segoe UI" w:hAnsi="Segoe UI"/>
-                <w:color w:val="22302B"/>
-                <w:sz w:val="17"/>
-                <w:szCs w:val="17"/>
-              </w:rPr>
-              <w:t xml:space="preserve">რეგისტრაცია</w:t>
+            <w:r>
+              <w:t>რეგისტრაცია + ვერიფიკაციის OTP</w:t>
             </w:r>
           </w:p>
         </w:tc>
@@ -8768,17 +8791,8 @@
             <w:vAlign w:val="top"/>
           </w:tcPr>
           <w:p>
-            <w:pPr>
-              <w:spacing w:after="0" w:line="260"/>
-            </w:pPr>
-            <w:r>
-              <w:rPr>
-                <w:rFonts w:ascii="Segoe UI" w:cs="Segoe UI" w:eastAsia="Segoe UI" w:hAnsi="Segoe UI"/>
-                <w:color w:val="22302B"/>
-                <w:sz w:val="17"/>
-                <w:szCs w:val="17"/>
-              </w:rPr>
-              <w:t xml:space="preserve">შესვლა, JWT</w:t>
+            <w:r>
+              <w:t>შესვლა, JWT (მხოლოდ დადასტურებული email)</w:t>
             </w:r>
           </w:p>
         </w:tc>
@@ -8833,6 +8847,214 @@
                 <w:szCs w:val="17"/>
               </w:rPr>
               <w:t xml:space="preserve">200</w:t>
+            </w:r>
+          </w:p>
+        </w:tc>
+      </w:tr>
+      <w:tr>
+        <w:tc>
+          <w:tcPr>
+            <w:tcW w:type="dxa" w:w="1100"/>
+          </w:tcPr>
+          <w:p>
+            <w:r>
+              <w:t>POST</w:t>
+            </w:r>
+          </w:p>
+        </w:tc>
+        <w:tc>
+          <w:tcPr>
+            <w:tcW w:type="dxa" w:w="3100"/>
+          </w:tcPr>
+          <w:p>
+            <w:r>
+              <w:t>/api/v1/auth/verify-email</w:t>
+            </w:r>
+          </w:p>
+        </w:tc>
+        <w:tc>
+          <w:tcPr>
+            <w:tcW w:type="dxa" w:w="2400"/>
+          </w:tcPr>
+          <w:p>
+            <w:r>
+              <w:t>ელ-ფოსტის დადასტურება OTP-ით</w:t>
+            </w:r>
+          </w:p>
+        </w:tc>
+        <w:tc>
+          <w:tcPr>
+            <w:tcW w:type="dxa" w:w="900"/>
+          </w:tcPr>
+          <w:p>
+            <w:r>
+              <w:t>არა</w:t>
+            </w:r>
+          </w:p>
+        </w:tc>
+        <w:tc>
+          <w:tcPr>
+            <w:tcW w:type="dxa" w:w="2100"/>
+          </w:tcPr>
+          <w:p>
+            <w:r>
+              <w:t>200</w:t>
+            </w:r>
+          </w:p>
+        </w:tc>
+      </w:tr>
+      <w:tr>
+        <w:tc>
+          <w:tcPr>
+            <w:tcW w:type="dxa" w:w="1100"/>
+          </w:tcPr>
+          <w:p>
+            <w:r>
+              <w:t>POST</w:t>
+            </w:r>
+          </w:p>
+        </w:tc>
+        <w:tc>
+          <w:tcPr>
+            <w:tcW w:type="dxa" w:w="3100"/>
+          </w:tcPr>
+          <w:p>
+            <w:r>
+              <w:t>/api/v1/auth/resend-verification</w:t>
+            </w:r>
+          </w:p>
+        </w:tc>
+        <w:tc>
+          <w:tcPr>
+            <w:tcW w:type="dxa" w:w="2400"/>
+          </w:tcPr>
+          <w:p>
+            <w:r>
+              <w:t>ვერიფიკაციის OTP-ის ხელახლა გაგზავნა</w:t>
+            </w:r>
+          </w:p>
+        </w:tc>
+        <w:tc>
+          <w:tcPr>
+            <w:tcW w:type="dxa" w:w="900"/>
+          </w:tcPr>
+          <w:p>
+            <w:r>
+              <w:t>არა</w:t>
+            </w:r>
+          </w:p>
+        </w:tc>
+        <w:tc>
+          <w:tcPr>
+            <w:tcW w:type="dxa" w:w="2100"/>
+          </w:tcPr>
+          <w:p>
+            <w:r>
+              <w:t>200</w:t>
+            </w:r>
+          </w:p>
+        </w:tc>
+      </w:tr>
+      <w:tr>
+        <w:tc>
+          <w:tcPr>
+            <w:tcW w:type="dxa" w:w="1100"/>
+          </w:tcPr>
+          <w:p>
+            <w:r>
+              <w:t>POST</w:t>
+            </w:r>
+          </w:p>
+        </w:tc>
+        <w:tc>
+          <w:tcPr>
+            <w:tcW w:type="dxa" w:w="3100"/>
+          </w:tcPr>
+          <w:p>
+            <w:r>
+              <w:t>/api/v1/auth/forgot-password</w:t>
+            </w:r>
+          </w:p>
+        </w:tc>
+        <w:tc>
+          <w:tcPr>
+            <w:tcW w:type="dxa" w:w="2400"/>
+          </w:tcPr>
+          <w:p>
+            <w:r>
+              <w:t>პაროლის აღდგენის OTP</w:t>
+            </w:r>
+          </w:p>
+        </w:tc>
+        <w:tc>
+          <w:tcPr>
+            <w:tcW w:type="dxa" w:w="900"/>
+          </w:tcPr>
+          <w:p>
+            <w:r>
+              <w:t>არა</w:t>
+            </w:r>
+          </w:p>
+        </w:tc>
+        <w:tc>
+          <w:tcPr>
+            <w:tcW w:type="dxa" w:w="2100"/>
+          </w:tcPr>
+          <w:p>
+            <w:r>
+              <w:t>200</w:t>
+            </w:r>
+          </w:p>
+        </w:tc>
+      </w:tr>
+      <w:tr>
+        <w:tc>
+          <w:tcPr>
+            <w:tcW w:type="dxa" w:w="1100"/>
+          </w:tcPr>
+          <w:p>
+            <w:r>
+              <w:t>POST</w:t>
+            </w:r>
+          </w:p>
+        </w:tc>
+        <w:tc>
+          <w:tcPr>
+            <w:tcW w:type="dxa" w:w="3100"/>
+          </w:tcPr>
+          <w:p>
+            <w:r>
+              <w:t>/api/v1/auth/reset-password</w:t>
+            </w:r>
+          </w:p>
+        </w:tc>
+        <w:tc>
+          <w:tcPr>
+            <w:tcW w:type="dxa" w:w="2400"/>
+          </w:tcPr>
+          <w:p>
+            <w:r>
+              <w:t>პაროლის შეცვლა OTP-ით</w:t>
+            </w:r>
+          </w:p>
+        </w:tc>
+        <w:tc>
+          <w:tcPr>
+            <w:tcW w:type="dxa" w:w="900"/>
+          </w:tcPr>
+          <w:p>
+            <w:r>
+              <w:t>არა</w:t>
+            </w:r>
+          </w:p>
+        </w:tc>
+        <w:tc>
+          <w:tcPr>
+            <w:tcW w:type="dxa" w:w="2100"/>
+          </w:tcPr>
+          <w:p>
+            <w:r>
+              <w:t>200</w:t>
             </w:r>
           </w:p>
         </w:tc>
@@ -10208,6 +10430,214 @@
                 <w:szCs w:val="17"/>
               </w:rPr>
               <w:t xml:space="preserve">204</w:t>
+            </w:r>
+          </w:p>
+        </w:tc>
+      </w:tr>
+      <w:tr>
+        <w:tc>
+          <w:tcPr>
+            <w:tcW w:type="dxa" w:w="1100"/>
+          </w:tcPr>
+          <w:p>
+            <w:r>
+              <w:t>GET</w:t>
+            </w:r>
+          </w:p>
+        </w:tc>
+        <w:tc>
+          <w:tcPr>
+            <w:tcW w:type="dxa" w:w="3100"/>
+          </w:tcPr>
+          <w:p>
+            <w:r>
+              <w:t>/api/v1/pet/{id}/photos</w:t>
+            </w:r>
+          </w:p>
+        </w:tc>
+        <w:tc>
+          <w:tcPr>
+            <w:tcW w:type="dxa" w:w="2400"/>
+          </w:tcPr>
+          <w:p>
+            <w:r>
+              <w:t>ცხოველის ფოტოები</w:t>
+            </w:r>
+          </w:p>
+        </w:tc>
+        <w:tc>
+          <w:tcPr>
+            <w:tcW w:type="dxa" w:w="900"/>
+          </w:tcPr>
+          <w:p>
+            <w:r>
+              <w:t>კი</w:t>
+            </w:r>
+          </w:p>
+        </w:tc>
+        <w:tc>
+          <w:tcPr>
+            <w:tcW w:type="dxa" w:w="2100"/>
+          </w:tcPr>
+          <w:p>
+            <w:r>
+              <w:t>200</w:t>
+            </w:r>
+          </w:p>
+        </w:tc>
+      </w:tr>
+      <w:tr>
+        <w:tc>
+          <w:tcPr>
+            <w:tcW w:type="dxa" w:w="1100"/>
+          </w:tcPr>
+          <w:p>
+            <w:r>
+              <w:t>POST</w:t>
+            </w:r>
+          </w:p>
+        </w:tc>
+        <w:tc>
+          <w:tcPr>
+            <w:tcW w:type="dxa" w:w="3100"/>
+          </w:tcPr>
+          <w:p>
+            <w:r>
+              <w:t>/api/v1/pet/{id}/photos</w:t>
+            </w:r>
+          </w:p>
+        </w:tc>
+        <w:tc>
+          <w:tcPr>
+            <w:tcW w:type="dxa" w:w="2400"/>
+          </w:tcPr>
+          <w:p>
+            <w:r>
+              <w:t>ფოტოს ატვირთვა (multipart, max 5 MB)</w:t>
+            </w:r>
+          </w:p>
+        </w:tc>
+        <w:tc>
+          <w:tcPr>
+            <w:tcW w:type="dxa" w:w="900"/>
+          </w:tcPr>
+          <w:p>
+            <w:r>
+              <w:t>კი</w:t>
+            </w:r>
+          </w:p>
+        </w:tc>
+        <w:tc>
+          <w:tcPr>
+            <w:tcW w:type="dxa" w:w="2100"/>
+          </w:tcPr>
+          <w:p>
+            <w:r>
+              <w:t>201</w:t>
+            </w:r>
+          </w:p>
+        </w:tc>
+      </w:tr>
+      <w:tr>
+        <w:tc>
+          <w:tcPr>
+            <w:tcW w:type="dxa" w:w="1100"/>
+          </w:tcPr>
+          <w:p>
+            <w:r>
+              <w:t>PUT</w:t>
+            </w:r>
+          </w:p>
+        </w:tc>
+        <w:tc>
+          <w:tcPr>
+            <w:tcW w:type="dxa" w:w="3100"/>
+          </w:tcPr>
+          <w:p>
+            <w:r>
+              <w:t>/api/v1/pet/{id}/photos/{photoId}/primary</w:t>
+            </w:r>
+          </w:p>
+        </w:tc>
+        <w:tc>
+          <w:tcPr>
+            <w:tcW w:type="dxa" w:w="2400"/>
+          </w:tcPr>
+          <w:p>
+            <w:r>
+              <w:t>მთავარი ფოტოს დაყენება</w:t>
+            </w:r>
+          </w:p>
+        </w:tc>
+        <w:tc>
+          <w:tcPr>
+            <w:tcW w:type="dxa" w:w="900"/>
+          </w:tcPr>
+          <w:p>
+            <w:r>
+              <w:t>კი</w:t>
+            </w:r>
+          </w:p>
+        </w:tc>
+        <w:tc>
+          <w:tcPr>
+            <w:tcW w:type="dxa" w:w="2100"/>
+          </w:tcPr>
+          <w:p>
+            <w:r>
+              <w:t>200</w:t>
+            </w:r>
+          </w:p>
+        </w:tc>
+      </w:tr>
+      <w:tr>
+        <w:tc>
+          <w:tcPr>
+            <w:tcW w:type="dxa" w:w="1100"/>
+          </w:tcPr>
+          <w:p>
+            <w:r>
+              <w:t>DELETE</w:t>
+            </w:r>
+          </w:p>
+        </w:tc>
+        <w:tc>
+          <w:tcPr>
+            <w:tcW w:type="dxa" w:w="3100"/>
+          </w:tcPr>
+          <w:p>
+            <w:r>
+              <w:t>/api/v1/pet/{id}/photos/{photoId}</w:t>
+            </w:r>
+          </w:p>
+        </w:tc>
+        <w:tc>
+          <w:tcPr>
+            <w:tcW w:type="dxa" w:w="2400"/>
+          </w:tcPr>
+          <w:p>
+            <w:r>
+              <w:t>ფოტოს წაშლა</w:t>
+            </w:r>
+          </w:p>
+        </w:tc>
+        <w:tc>
+          <w:tcPr>
+            <w:tcW w:type="dxa" w:w="900"/>
+          </w:tcPr>
+          <w:p>
+            <w:r>
+              <w:t>კი</w:t>
+            </w:r>
+          </w:p>
+        </w:tc>
+        <w:tc>
+          <w:tcPr>
+            <w:tcW w:type="dxa" w:w="2100"/>
+          </w:tcPr>
+          <w:p>
+            <w:r>
+              <w:t>204</w:t>
             </w:r>
           </w:p>
         </w:tc>
@@ -10539,17 +10969,8 @@
             <w:vAlign w:val="top"/>
           </w:tcPr>
           <w:p>
-            <w:pPr>
-              <w:spacing w:after="0" w:line="260"/>
-            </w:pPr>
-            <w:r>
-              <w:rPr>
-                <w:rFonts w:ascii="Consolas" w:cs="Consolas" w:eastAsia="Consolas" w:hAnsi="Consolas"/>
-                <w:color w:val="22302B"/>
-                <w:sz w:val="16"/>
-                <w:szCs w:val="16"/>
-              </w:rPr>
-              <w:t xml:space="preserve">არ ბრუნდება — საჭიროა ცალკე login</w:t>
+            <w:r>
+              <w:t>არ ბრუნდება — საჭიროა ცალკე login. login დაშვებულია მხოლოდ email-ის ვერიფიკაციის შემდეგ.</w:t>
             </w:r>
           </w:p>
         </w:tc>
@@ -11950,7 +12371,7 @@
                 <w:sz w:val="15"/>
                 <w:szCs w:val="15"/>
               </w:rPr>
-              <w:t xml:space="preserve">  "id": "1",</w:t>
+              <w:t xml:space="preserve">  "id": 1,</w:t>
             </w:r>
           </w:p>
           <w:p>
@@ -12062,7 +12483,17 @@
                 <w:sz w:val="15"/>
                 <w:szCs w:val="15"/>
               </w:rPr>
-              <w:t xml:space="preserve">  "isVerified": false,</w:t>
+              <w:t xml:space="preserve">  "isEmailVerified": false,</w:t>
+            </w:r>
+          </w:p>
+          <w:p>
+            <w:pPr/>
+            <w:r>
+              <w:rPr>
+                <w:rFonts w:ascii="Consolas" w:hAnsi="Consolas"/>
+                <w:sz w:val="15"/>
+              </w:rPr>
+              <w:t xml:space="preserve">  "emailVerifiedAt": null,</w:t>
             </w:r>
           </w:p>
           <w:p>
@@ -12674,6 +13105,12 @@
         </w:tc>
       </w:tr>
     </w:tbl>
+    <w:p>
+      <w:pPr/>
+      <w:r>
+        <w:t>რეგისტრაციის შემდეგ იგზავნება 6-ციფრიანი OTP. login ამ ეტაპზე 403-ს აბრუნებს; ჯერ უნდა გამოიძახო POST /api/v1/auth/verify-email.</w:t>
+      </w:r>
+    </w:p>
     <w:p>
       <w:pPr>
         <w:pStyle w:val="Heading2"/>
@@ -13574,7 +14011,17 @@
                 <w:sz w:val="15"/>
                 <w:szCs w:val="15"/>
               </w:rPr>
-              <w:t xml:space="preserve">  "role": "User"</w:t>
+              <w:t xml:space="preserve">  "role": "User",</w:t>
+            </w:r>
+          </w:p>
+          <w:p>
+            <w:pPr/>
+            <w:r>
+              <w:rPr>
+                <w:rFonts w:ascii="Consolas" w:hAnsi="Consolas"/>
+                <w:sz w:val="15"/>
+              </w:rPr>
+              <w:t xml:space="preserve">  "isEmailVerified": true</w:t>
             </w:r>
           </w:p>
           <w:p>
@@ -13891,6 +14338,38 @@
           </w:p>
         </w:tc>
       </w:tr>
+      <w:tr>
+        <w:tc>
+          <w:tcPr>
+            <w:tcW w:type="dxa" w:w="900"/>
+          </w:tcPr>
+          <w:p>
+            <w:r>
+              <w:t>403</w:t>
+            </w:r>
+          </w:p>
+        </w:tc>
+        <w:tc>
+          <w:tcPr>
+            <w:tcW w:type="dxa" w:w="5200"/>
+          </w:tcPr>
+          <w:p>
+            <w:r>
+              <w:t>{ "code": "EMAIL_NOT_VERIFIED", "message": "გთხოვთ დაადასტუროთ ელ-ფოსტა." }</w:t>
+            </w:r>
+          </w:p>
+        </w:tc>
+        <w:tc>
+          <w:tcPr>
+            <w:tcW w:type="dxa" w:w="3500"/>
+          </w:tcPr>
+          <w:p>
+            <w:r>
+              <w:t>email არ არის დადასტურებული</w:t>
+            </w:r>
+          </w:p>
+        </w:tc>
+      </w:tr>
     </w:tbl>
     <w:p>
       <w:pPr>
@@ -13929,33 +14408,8 @@
             </w:tcMar>
           </w:tcPr>
           <w:p>
-            <w:pPr>
-              <w:spacing w:after="70" w:line="260"/>
-            </w:pPr>
-            <w:r>
-              <w:rPr>
-                <w:rFonts w:ascii="Segoe UI" w:cs="Segoe UI" w:eastAsia="Segoe UI" w:hAnsi="Segoe UI"/>
-                <w:b/>
-                <w:bCs/>
-                <w:color w:val="1F6F5C"/>
-                <w:sz w:val="18"/>
-                <w:szCs w:val="18"/>
-              </w:rPr>
-              <w:t xml:space="preserve">ერთი და იგივე შეტყობინება</w:t>
-            </w:r>
-          </w:p>
-          <w:p>
-            <w:pPr>
-              <w:spacing w:after="40" w:line="270"/>
-            </w:pPr>
-            <w:r>
-              <w:rPr>
-                <w:rFonts w:ascii="Segoe UI" w:cs="Segoe UI" w:eastAsia="Segoe UI" w:hAnsi="Segoe UI"/>
-                <w:color w:val="22302B"/>
-                <w:sz w:val="18"/>
-                <w:szCs w:val="18"/>
-              </w:rPr>
-              <w:t xml:space="preserve">401-ის ტექსტი განზრახ არ აკონკრეტებს, რომელი ველია არასწორი — ეს უსაფრთხოების სტანდარტია. UI-შიც ნუ დააკონკრეტებ, დაწერე ზოგადი „ელ-ფოსტა ან პაროლი არასწორია“.</w:t>
+            <w:r>
+              <w:t>401-ის ტექსტი განზრახ არ აკონკრეტებს, რომელი ველია არასწორი. 403 EMAIL_NOT_VERIFIED ნიშნავს, რომ პაროლი სწორია, მაგრამ email არ არის დადასტურებული — აჩვენე /verify-email ეკრანი.</w:t>
             </w:r>
           </w:p>
         </w:tc>
@@ -15570,13 +16024,7 @@
         <w:spacing w:after="120" w:line="300"/>
       </w:pPr>
       <w:r>
-        <w:rPr>
-          <w:rFonts w:ascii="Segoe UI" w:cs="Segoe UI" w:eastAsia="Segoe UI" w:hAnsi="Segoe UI"/>
-          <w:color w:val="22302B"/>
-          <w:sz w:val="20"/>
-          <w:szCs w:val="20"/>
-        </w:rPr>
-        <w:t xml:space="preserve">შეცვლადი არ არის: email, personalId, birthDate, role, isVerified, profileImageUrl. ამ ველების გაგზავნა უგულებელყოფილი იქნება.</w:t>
+        <w:t>შეცვლადი არ არის: email, personalId, birthDate, role, isEmailVerified, emailVerifiedAt, profileImageUrl. ამ ველების გაგზავნა უგულებელყოფილი იქნება.</w:t>
       </w:r>
     </w:p>
     <w:tbl>
@@ -17514,17 +17962,8 @@
             <w:vAlign w:val="top"/>
           </w:tcPr>
           <w:p>
-            <w:pPr>
-              <w:spacing w:after="0" w:line="260"/>
-            </w:pPr>
-            <w:r>
-              <w:rPr>
-                <w:rFonts w:ascii="Segoe UI" w:cs="Segoe UI" w:eastAsia="Segoe UI" w:hAnsi="Segoe UI"/>
-                <w:color w:val="22302B"/>
-                <w:sz w:val="17"/>
-                <w:szCs w:val="17"/>
-              </w:rPr>
-              <w:t xml:space="preserve">კი</w:t>
+            <w:r>
+              <w:t>არა</w:t>
             </w:r>
           </w:p>
         </w:tc>
@@ -17541,17 +17980,8 @@
             <w:vAlign w:val="top"/>
           </w:tcPr>
           <w:p>
-            <w:pPr>
-              <w:spacing w:after="0" w:line="260"/>
-            </w:pPr>
-            <w:r>
-              <w:rPr>
-                <w:rFonts w:ascii="Segoe UI" w:cs="Segoe UI" w:eastAsia="Segoe UI" w:hAnsi="Segoe UI"/>
-                <w:color w:val="22302B"/>
-                <w:sz w:val="17"/>
-                <w:szCs w:val="17"/>
-              </w:rPr>
-              <w:t xml:space="preserve">მაქს. 15 სიმბოლო, უნიკალური</w:t>
+            <w:r>
+              <w:t>მაქს. 15 სიმბოლო, უნიკალური თუ მითითებულია</w:t>
             </w:r>
           </w:p>
         </w:tc>
@@ -18460,7 +18890,7 @@
                 <w:sz w:val="15"/>
                 <w:szCs w:val="15"/>
               </w:rPr>
-              <w:t xml:space="preserve">  "id": "1",</w:t>
+              <w:t xml:space="preserve">  "id": 1,</w:t>
             </w:r>
           </w:p>
           <w:p>
@@ -18474,7 +18904,7 @@
                 <w:sz w:val="15"/>
                 <w:szCs w:val="15"/>
               </w:rPr>
-              <w:t xml:space="preserve">  "ownerId": "1",</w:t>
+              <w:t xml:space="preserve">  "ownerId": 1,</w:t>
             </w:r>
           </w:p>
           <w:p>
@@ -18840,7 +19270,7 @@
                 <w:sz w:val="17"/>
                 <w:szCs w:val="17"/>
               </w:rPr>
-              <w:t xml:space="preserve">ვალიდაცია: სახელი, სახეობა, მიკროჩიპი, სქესი</w:t>
+              <w:t>ვალიდაცია: სახელი, სახეობა, სქესი</w:t>
             </w:r>
           </w:p>
         </w:tc>
@@ -19812,6 +20242,174 @@
           </w:p>
         </w:tc>
       </w:tr>
+      <w:tr>
+        <w:tc>
+          <w:tcPr>
+            <w:tcW w:type="dxa" w:w="1100"/>
+          </w:tcPr>
+          <w:p>
+            <w:r>
+              <w:t>GET</w:t>
+            </w:r>
+          </w:p>
+        </w:tc>
+        <w:tc>
+          <w:tcPr>
+            <w:tcW w:type="dxa" w:w="3300"/>
+          </w:tcPr>
+          <w:p>
+            <w:r>
+              <w:t>/api/v1/pet/{id}/photos</w:t>
+            </w:r>
+          </w:p>
+        </w:tc>
+        <w:tc>
+          <w:tcPr>
+            <w:tcW w:type="dxa" w:w="2300"/>
+          </w:tcPr>
+          <w:p>
+            <w:r>
+              <w:t>200 PetPhotoResponse[]</w:t>
+            </w:r>
+          </w:p>
+        </w:tc>
+        <w:tc>
+          <w:tcPr>
+            <w:tcW w:type="dxa" w:w="2900"/>
+          </w:tcPr>
+          <w:p>
+            <w:r>
+              <w:t>მხოლოდ მფლობელი ან Admin</w:t>
+            </w:r>
+          </w:p>
+        </w:tc>
+      </w:tr>
+      <w:tr>
+        <w:tc>
+          <w:tcPr>
+            <w:tcW w:type="dxa" w:w="1100"/>
+          </w:tcPr>
+          <w:p>
+            <w:r>
+              <w:t>POST</w:t>
+            </w:r>
+          </w:p>
+        </w:tc>
+        <w:tc>
+          <w:tcPr>
+            <w:tcW w:type="dxa" w:w="3300"/>
+          </w:tcPr>
+          <w:p>
+            <w:r>
+              <w:t>/api/v1/pet/{id}/photos</w:t>
+            </w:r>
+          </w:p>
+        </w:tc>
+        <w:tc>
+          <w:tcPr>
+            <w:tcW w:type="dxa" w:w="2300"/>
+          </w:tcPr>
+          <w:p>
+            <w:r>
+              <w:t>201 PetPhotoResponse</w:t>
+            </w:r>
+          </w:p>
+        </w:tc>
+        <w:tc>
+          <w:tcPr>
+            <w:tcW w:type="dxa" w:w="2900"/>
+          </w:tcPr>
+          <w:p>
+            <w:r>
+              <w:t>multipart, max 5 MB, max 10 ფოტო</w:t>
+            </w:r>
+          </w:p>
+        </w:tc>
+      </w:tr>
+      <w:tr>
+        <w:tc>
+          <w:tcPr>
+            <w:tcW w:type="dxa" w:w="1100"/>
+          </w:tcPr>
+          <w:p>
+            <w:r>
+              <w:t>PUT</w:t>
+            </w:r>
+          </w:p>
+        </w:tc>
+        <w:tc>
+          <w:tcPr>
+            <w:tcW w:type="dxa" w:w="3300"/>
+          </w:tcPr>
+          <w:p>
+            <w:r>
+              <w:t>/api/v1/pet/{id}/photos/{photoId}/primary</w:t>
+            </w:r>
+          </w:p>
+        </w:tc>
+        <w:tc>
+          <w:tcPr>
+            <w:tcW w:type="dxa" w:w="2300"/>
+          </w:tcPr>
+          <w:p>
+            <w:r>
+              <w:t>200 PetPhotoResponse</w:t>
+            </w:r>
+          </w:p>
+        </w:tc>
+        <w:tc>
+          <w:tcPr>
+            <w:tcW w:type="dxa" w:w="2900"/>
+          </w:tcPr>
+          <w:p>
+            <w:r>
+              <w:t>მთავარი ფოტო</w:t>
+            </w:r>
+          </w:p>
+        </w:tc>
+      </w:tr>
+      <w:tr>
+        <w:tc>
+          <w:tcPr>
+            <w:tcW w:type="dxa" w:w="1100"/>
+          </w:tcPr>
+          <w:p>
+            <w:r>
+              <w:t>DELETE</w:t>
+            </w:r>
+          </w:p>
+        </w:tc>
+        <w:tc>
+          <w:tcPr>
+            <w:tcW w:type="dxa" w:w="3300"/>
+          </w:tcPr>
+          <w:p>
+            <w:r>
+              <w:t>/api/v1/pet/{id}/photos/{photoId}</w:t>
+            </w:r>
+          </w:p>
+        </w:tc>
+        <w:tc>
+          <w:tcPr>
+            <w:tcW w:type="dxa" w:w="2300"/>
+          </w:tcPr>
+          <w:p>
+            <w:r>
+              <w:t>204 No Content</w:t>
+            </w:r>
+          </w:p>
+        </w:tc>
+        <w:tc>
+          <w:tcPr>
+            <w:tcW w:type="dxa" w:w="2900"/>
+          </w:tcPr>
+          <w:p>
+            <w:r>
+              <w:t>S3 ობიექტიც იშლება</w:t>
+            </w:r>
+          </w:p>
+        </w:tc>
+      </w:tr>
     </w:tbl>
     <w:p>
       <w:pPr>
@@ -19831,6 +20429,20 @@
       <w:pPr>
         <w:spacing w:after="40"/>
       </w:pPr>
+    </w:p>
+    <w:p>
+      <w:pPr>
+        <w:pStyle w:val="Heading3"/>
+      </w:pPr>
+      <w:r>
+        <w:t>7.7.1 ცხოველის ფოტოები</w:t>
+      </w:r>
+    </w:p>
+    <w:p>
+      <w:pPr/>
+      <w:r>
+        <w:t>ფოტო იტვირთება multipart/form-data-ით. დასაშვებია JPEG, PNG და WebP, მაქსიმუმ 5 MB და მაქსიმუმ 10 ფოტო ერთ ცხოველზე. ბაზაში ინახება მხოლოდ S3 object key; URL ბრუნდება PetPhotoResponse-ში. ყველა ოპერაცია მხოლოდ მფლობელს ან Admin-ს შეუძლია.</w:t>
+      </w:r>
     </w:p>
     <w:p>
       <w:pPr>
@@ -20064,34 +20676,32 @@
         <w:tc>
           <w:tcPr>
             <w:tcW w:type="dxa" w:w="3300"/>
-            <w:shd w:fill="F4F8F6" w:val="clear"/>
-            <w:tcMar>
-              <w:top w:type="dxa" w:w="70"/>
-              <w:left w:type="dxa" w:w="120"/>
-              <w:bottom w:type="dxa" w:w="70"/>
-              <w:right w:type="dxa" w:w="120"/>
-            </w:tcMar>
-            <w:vAlign w:val="top"/>
-          </w:tcPr>
-          <w:p>
-            <w:pPr>
-              <w:spacing w:after="0" w:line="260"/>
-            </w:pPr>
-            <w:r>
-              <w:rPr>
-                <w:rFonts w:ascii="Segoe UI" w:cs="Segoe UI" w:eastAsia="Segoe UI" w:hAnsi="Segoe UI"/>
-                <w:color w:val="22302B"/>
-                <w:sz w:val="17"/>
-                <w:szCs w:val="17"/>
-              </w:rPr>
-              <w:t xml:space="preserve">პაროლის შეცვლა / აღდგენა</w:t>
+            <w:tcMar>
+              <w:top w:type="dxa" w:w="70"/>
+              <w:left w:type="dxa" w:w="120"/>
+              <w:bottom w:type="dxa" w:w="70"/>
+              <w:right w:type="dxa" w:w="120"/>
+            </w:tcMar>
+            <w:vAlign w:val="top"/>
+          </w:tcPr>
+          <w:p>
+            <w:pPr>
+              <w:spacing w:after="0" w:line="260"/>
+            </w:pPr>
+            <w:r>
+              <w:rPr>
+                <w:rFonts w:ascii="Segoe UI" w:cs="Segoe UI" w:eastAsia="Segoe UI" w:hAnsi="Segoe UI"/>
+                <w:color w:val="22302B"/>
+                <w:sz w:val="17"/>
+                <w:szCs w:val="17"/>
+              </w:rPr>
+              <w:t xml:space="preserve">ავატარის ატვირთვა</w:t>
             </w:r>
           </w:p>
         </w:tc>
         <w:tc>
           <w:tcPr>
             <w:tcW w:type="dxa" w:w="2200"/>
-            <w:shd w:fill="F4F8F6" w:val="clear"/>
             <w:tcMar>
               <w:top w:type="dxa" w:w="70"/>
               <w:left w:type="dxa" w:w="120"/>
@@ -20118,27 +20728,26 @@
         <w:tc>
           <w:tcPr>
             <w:tcW w:type="dxa" w:w="4100"/>
-            <w:shd w:fill="F4F8F6" w:val="clear"/>
-            <w:tcMar>
-              <w:top w:type="dxa" w:w="70"/>
-              <w:left w:type="dxa" w:w="120"/>
-              <w:bottom w:type="dxa" w:w="70"/>
-              <w:right w:type="dxa" w:w="120"/>
-            </w:tcMar>
-            <w:vAlign w:val="top"/>
-          </w:tcPr>
-          <w:p>
-            <w:pPr>
-              <w:spacing w:after="0" w:line="260"/>
-            </w:pPr>
-            <w:r>
-              <w:rPr>
-                <w:rFonts w:ascii="Segoe UI" w:cs="Segoe UI" w:eastAsia="Segoe UI" w:hAnsi="Segoe UI"/>
-                <w:color w:val="22302B"/>
-                <w:sz w:val="17"/>
-                <w:szCs w:val="17"/>
-              </w:rPr>
-              <w:t xml:space="preserve">UI ჯერ არ დაგეგმო</w:t>
+            <w:tcMar>
+              <w:top w:type="dxa" w:w="70"/>
+              <w:left w:type="dxa" w:w="120"/>
+              <w:bottom w:type="dxa" w:w="70"/>
+              <w:right w:type="dxa" w:w="120"/>
+            </w:tcMar>
+            <w:vAlign w:val="top"/>
+          </w:tcPr>
+          <w:p>
+            <w:pPr>
+              <w:spacing w:after="0" w:line="260"/>
+            </w:pPr>
+            <w:r>
+              <w:rPr>
+                <w:rFonts w:ascii="Segoe UI" w:cs="Segoe UI" w:eastAsia="Segoe UI" w:hAnsi="Segoe UI"/>
+                <w:color w:val="22302B"/>
+                <w:sz w:val="17"/>
+                <w:szCs w:val="17"/>
+              </w:rPr>
+              <w:t xml:space="preserve">multipart endpoint არ არის</w:t>
             </w:r>
           </w:p>
         </w:tc>
@@ -20169,7 +20778,7 @@
                 <w:sz w:val="17"/>
                 <w:szCs w:val="17"/>
               </w:rPr>
-              <w:t xml:space="preserve">ავატარის ატვირთვა</w:t>
+              <w:t xml:space="preserve">Refresh token / logout</w:t>
             </w:r>
           </w:p>
         </w:tc>
@@ -20221,7 +20830,7 @@
                 <w:sz w:val="17"/>
                 <w:szCs w:val="17"/>
               </w:rPr>
-              <w:t xml:space="preserve">multipart endpoint არ არის</w:t>
+              <w:t xml:space="preserve">token-ის ვადა 7 დღე</w:t>
             </w:r>
           </w:p>
         </w:tc>
@@ -20253,7 +20862,7 @@
                 <w:sz w:val="17"/>
                 <w:szCs w:val="17"/>
               </w:rPr>
-              <w:t xml:space="preserve">ელ-ფოსტის ვერიფიკაცია</w:t>
+              <w:t xml:space="preserve">Pagination / ფილტრები</w:t>
             </w:r>
           </w:p>
         </w:tc>
@@ -20307,176 +20916,39 @@
                 <w:sz w:val="17"/>
                 <w:szCs w:val="17"/>
               </w:rPr>
-              <w:t xml:space="preserve">IsVerified ყოველთვის false</w:t>
+              <w:t xml:space="preserve">სიის endpoint-ები არ არის</w:t>
             </w:r>
           </w:p>
         </w:tc>
       </w:tr>
       <w:tr>
-        <w:trPr>
-          <w:cantSplit/>
-        </w:trPr>
         <w:tc>
           <w:tcPr>
             <w:tcW w:type="dxa" w:w="3300"/>
-            <w:tcMar>
-              <w:top w:type="dxa" w:w="70"/>
-              <w:left w:type="dxa" w:w="120"/>
-              <w:bottom w:type="dxa" w:w="70"/>
-              <w:right w:type="dxa" w:w="120"/>
-            </w:tcMar>
-            <w:vAlign w:val="top"/>
-          </w:tcPr>
-          <w:p>
-            <w:pPr>
-              <w:spacing w:after="0" w:line="260"/>
-            </w:pPr>
-            <w:r>
-              <w:rPr>
-                <w:rFonts w:ascii="Segoe UI" w:cs="Segoe UI" w:eastAsia="Segoe UI" w:hAnsi="Segoe UI"/>
-                <w:color w:val="22302B"/>
-                <w:sz w:val="17"/>
-                <w:szCs w:val="17"/>
-              </w:rPr>
-              <w:t xml:space="preserve">Refresh token / logout</w:t>
+          </w:tcPr>
+          <w:p>
+            <w:r>
+              <w:t>Login rate limiting</w:t>
             </w:r>
           </w:p>
         </w:tc>
         <w:tc>
           <w:tcPr>
             <w:tcW w:type="dxa" w:w="2200"/>
-            <w:tcMar>
-              <w:top w:type="dxa" w:w="70"/>
-              <w:left w:type="dxa" w:w="120"/>
-              <w:bottom w:type="dxa" w:w="70"/>
-              <w:right w:type="dxa" w:w="120"/>
-            </w:tcMar>
-            <w:vAlign w:val="top"/>
-          </w:tcPr>
-          <w:p>
-            <w:pPr>
-              <w:spacing w:after="0" w:line="260"/>
-            </w:pPr>
-            <w:r>
-              <w:rPr>
-                <w:rFonts w:ascii="Segoe UI" w:cs="Segoe UI" w:eastAsia="Segoe UI" w:hAnsi="Segoe UI"/>
-                <w:color w:val="22302B"/>
-                <w:sz w:val="17"/>
-                <w:szCs w:val="17"/>
-              </w:rPr>
-              <w:t xml:space="preserve">არ არსებობს</w:t>
+          </w:tcPr>
+          <w:p>
+            <w:r>
+              <w:t>არ არსებობს</w:t>
             </w:r>
           </w:p>
         </w:tc>
         <w:tc>
           <w:tcPr>
             <w:tcW w:type="dxa" w:w="4100"/>
-            <w:tcMar>
-              <w:top w:type="dxa" w:w="70"/>
-              <w:left w:type="dxa" w:w="120"/>
-              <w:bottom w:type="dxa" w:w="70"/>
-              <w:right w:type="dxa" w:w="120"/>
-            </w:tcMar>
-            <w:vAlign w:val="top"/>
-          </w:tcPr>
-          <w:p>
-            <w:pPr>
-              <w:spacing w:after="0" w:line="260"/>
-            </w:pPr>
-            <w:r>
-              <w:rPr>
-                <w:rFonts w:ascii="Segoe UI" w:cs="Segoe UI" w:eastAsia="Segoe UI" w:hAnsi="Segoe UI"/>
-                <w:color w:val="22302B"/>
-                <w:sz w:val="17"/>
-                <w:szCs w:val="17"/>
-              </w:rPr>
-              <w:t xml:space="preserve">token-ის ვადა 7 დღე</w:t>
-            </w:r>
-          </w:p>
-        </w:tc>
-      </w:tr>
-      <w:tr>
-        <w:trPr>
-          <w:cantSplit/>
-        </w:trPr>
-        <w:tc>
-          <w:tcPr>
-            <w:tcW w:type="dxa" w:w="3300"/>
-            <w:shd w:fill="F4F8F6" w:val="clear"/>
-            <w:tcMar>
-              <w:top w:type="dxa" w:w="70"/>
-              <w:left w:type="dxa" w:w="120"/>
-              <w:bottom w:type="dxa" w:w="70"/>
-              <w:right w:type="dxa" w:w="120"/>
-            </w:tcMar>
-            <w:vAlign w:val="top"/>
-          </w:tcPr>
-          <w:p>
-            <w:pPr>
-              <w:spacing w:after="0" w:line="260"/>
-            </w:pPr>
-            <w:r>
-              <w:rPr>
-                <w:rFonts w:ascii="Segoe UI" w:cs="Segoe UI" w:eastAsia="Segoe UI" w:hAnsi="Segoe UI"/>
-                <w:color w:val="22302B"/>
-                <w:sz w:val="17"/>
-                <w:szCs w:val="17"/>
-              </w:rPr>
-              <w:t xml:space="preserve">Pagination / ფილტრები</w:t>
-            </w:r>
-          </w:p>
-        </w:tc>
-        <w:tc>
-          <w:tcPr>
-            <w:tcW w:type="dxa" w:w="2200"/>
-            <w:shd w:fill="F4F8F6" w:val="clear"/>
-            <w:tcMar>
-              <w:top w:type="dxa" w:w="70"/>
-              <w:left w:type="dxa" w:w="120"/>
-              <w:bottom w:type="dxa" w:w="70"/>
-              <w:right w:type="dxa" w:w="120"/>
-            </w:tcMar>
-            <w:vAlign w:val="top"/>
-          </w:tcPr>
-          <w:p>
-            <w:pPr>
-              <w:spacing w:after="0" w:line="260"/>
-            </w:pPr>
-            <w:r>
-              <w:rPr>
-                <w:rFonts w:ascii="Segoe UI" w:cs="Segoe UI" w:eastAsia="Segoe UI" w:hAnsi="Segoe UI"/>
-                <w:color w:val="22302B"/>
-                <w:sz w:val="17"/>
-                <w:szCs w:val="17"/>
-              </w:rPr>
-              <w:t xml:space="preserve">არ არსებობს</w:t>
-            </w:r>
-          </w:p>
-        </w:tc>
-        <w:tc>
-          <w:tcPr>
-            <w:tcW w:type="dxa" w:w="4100"/>
-            <w:shd w:fill="F4F8F6" w:val="clear"/>
-            <w:tcMar>
-              <w:top w:type="dxa" w:w="70"/>
-              <w:left w:type="dxa" w:w="120"/>
-              <w:bottom w:type="dxa" w:w="70"/>
-              <w:right w:type="dxa" w:w="120"/>
-            </w:tcMar>
-            <w:vAlign w:val="top"/>
-          </w:tcPr>
-          <w:p>
-            <w:pPr>
-              <w:spacing w:after="0" w:line="260"/>
-            </w:pPr>
-            <w:r>
-              <w:rPr>
-                <w:rFonts w:ascii="Segoe UI" w:cs="Segoe UI" w:eastAsia="Segoe UI" w:hAnsi="Segoe UI"/>
-                <w:color w:val="22302B"/>
-                <w:sz w:val="17"/>
-                <w:szCs w:val="17"/>
-              </w:rPr>
-              <w:t xml:space="preserve">სიის endpoint-ები არ არის</w:t>
+          </w:tcPr>
+          <w:p>
+            <w:r>
+              <w:t>OTP-ზე limit არსებობს; login-ზე არა</w:t>
             </w:r>
           </w:p>
         </w:tc>
@@ -20521,13 +20993,7 @@
         <w:spacing w:after="120" w:line="300"/>
       </w:pPr>
       <w:r>
-        <w:rPr>
-          <w:rFonts w:ascii="Segoe UI" w:cs="Segoe UI" w:eastAsia="Segoe UI" w:hAnsi="Segoe UI"/>
-          <w:color w:val="22302B"/>
-          <w:sz w:val="20"/>
-          <w:szCs w:val="20"/>
-        </w:rPr>
-        <w:t xml:space="preserve">ბრუნდება register, get და update endpoint-ებიდან.</w:t>
+        <w:t>ბრუნდება register, get და update endpoint-ებიდან. isEmailVerified მართალია მხოლოდ ელ-ფოსტის ვერიფიკაციის შემდეგ; emailVerifiedAt მანამდე null-ია.</w:t>
       </w:r>
     </w:p>
     <w:tbl>
@@ -21585,7 +22051,7 @@
                 <w:sz w:val="16"/>
                 <w:szCs w:val="16"/>
               </w:rPr>
-              <w:t xml:space="preserve">isVerified</w:t>
+              <w:t>isEmailVerified</w:t>
             </w:r>
           </w:p>
         </w:tc>
@@ -21653,17 +22119,50 @@
             <w:vAlign w:val="top"/>
           </w:tcPr>
           <w:p>
-            <w:pPr>
-              <w:spacing w:after="0" w:line="260"/>
-            </w:pPr>
-            <w:r>
-              <w:rPr>
-                <w:rFonts w:ascii="Segoe UI" w:cs="Segoe UI" w:eastAsia="Segoe UI" w:hAnsi="Segoe UI"/>
-                <w:color w:val="22302B"/>
-                <w:sz w:val="17"/>
-                <w:szCs w:val="17"/>
-              </w:rPr>
-              <w:t xml:space="preserve">ყოველთვის false დღეს</w:t>
+            <w:r>
+              <w:t>true მხოლოდ ვერიფიკაციის შემდეგ</w:t>
+            </w:r>
+          </w:p>
+        </w:tc>
+      </w:tr>
+      <w:tr>
+        <w:tc>
+          <w:tcPr>
+            <w:tcW w:type="dxa" w:w="2200"/>
+          </w:tcPr>
+          <w:p>
+            <w:r>
+              <w:t>emailVerifiedAt</w:t>
+            </w:r>
+          </w:p>
+        </w:tc>
+        <w:tc>
+          <w:tcPr>
+            <w:tcW w:type="dxa" w:w="2500"/>
+          </w:tcPr>
+          <w:p>
+            <w:r>
+              <w:t>string (date-time)</w:t>
+            </w:r>
+          </w:p>
+        </w:tc>
+        <w:tc>
+          <w:tcPr>
+            <w:tcW w:type="dxa" w:w="900"/>
+          </w:tcPr>
+          <w:p>
+            <w:r>
+              <w:t>კი</w:t>
+            </w:r>
+          </w:p>
+        </w:tc>
+        <w:tc>
+          <w:tcPr>
+            <w:tcW w:type="dxa" w:w="4000"/>
+          </w:tcPr>
+          <w:p>
+            <w:r>
+              <w:t>ვერიფიკაციის დრო ან null</w:t>
             </w:r>
           </w:p>
         </w:tc>
@@ -22553,6 +23052,38 @@
           </w:p>
         </w:tc>
       </w:tr>
+      <w:tr>
+        <w:tc>
+          <w:tcPr>
+            <w:tcW w:type="dxa" w:w="2200"/>
+          </w:tcPr>
+          <w:p>
+            <w:r>
+              <w:t>isEmailVerified</w:t>
+            </w:r>
+          </w:p>
+        </w:tc>
+        <w:tc>
+          <w:tcPr>
+            <w:tcW w:type="dxa" w:w="2200"/>
+          </w:tcPr>
+          <w:p>
+            <w:r>
+              <w:t>boolean</w:t>
+            </w:r>
+          </w:p>
+        </w:tc>
+        <w:tc>
+          <w:tcPr>
+            <w:tcW w:type="dxa" w:w="5200"/>
+          </w:tcPr>
+          <w:p>
+            <w:r>
+              <w:t>ყოველთვის true — unverified login 403-ს აბრუნებს</w:t>
+            </w:r>
+          </w:p>
+        </w:tc>
+      </w:tr>
     </w:tbl>
     <w:p>
       <w:pPr>
@@ -22937,6 +23468,94 @@
                 <w:szCs w:val="17"/>
               </w:rPr>
               <w:t xml:space="preserve">name, species, breed?, microchipNumber, birthDate?, gender, color?, distinguishingMarks?, isLost?</w:t>
+            </w:r>
+          </w:p>
+        </w:tc>
+      </w:tr>
+      <w:tr>
+        <w:tc>
+          <w:tcPr>
+            <w:tcW w:type="dxa" w:w="2700"/>
+          </w:tcPr>
+          <w:p>
+            <w:r>
+              <w:t>VerifyEmailRequest</w:t>
+            </w:r>
+          </w:p>
+        </w:tc>
+        <w:tc>
+          <w:tcPr>
+            <w:tcW w:type="dxa" w:w="6900"/>
+          </w:tcPr>
+          <w:p>
+            <w:r>
+              <w:t>email, code (6 ციფრი)</w:t>
+            </w:r>
+          </w:p>
+        </w:tc>
+      </w:tr>
+      <w:tr>
+        <w:tc>
+          <w:tcPr>
+            <w:tcW w:type="dxa" w:w="2700"/>
+          </w:tcPr>
+          <w:p>
+            <w:r>
+              <w:t>ResendVerificationRequest</w:t>
+            </w:r>
+          </w:p>
+        </w:tc>
+        <w:tc>
+          <w:tcPr>
+            <w:tcW w:type="dxa" w:w="6900"/>
+          </w:tcPr>
+          <w:p>
+            <w:r>
+              <w:t>email</w:t>
+            </w:r>
+          </w:p>
+        </w:tc>
+      </w:tr>
+      <w:tr>
+        <w:tc>
+          <w:tcPr>
+            <w:tcW w:type="dxa" w:w="2700"/>
+          </w:tcPr>
+          <w:p>
+            <w:r>
+              <w:t>ForgotPasswordRequest</w:t>
+            </w:r>
+          </w:p>
+        </w:tc>
+        <w:tc>
+          <w:tcPr>
+            <w:tcW w:type="dxa" w:w="6900"/>
+          </w:tcPr>
+          <w:p>
+            <w:r>
+              <w:t>email</w:t>
+            </w:r>
+          </w:p>
+        </w:tc>
+      </w:tr>
+      <w:tr>
+        <w:tc>
+          <w:tcPr>
+            <w:tcW w:type="dxa" w:w="2700"/>
+          </w:tcPr>
+          <w:p>
+            <w:r>
+              <w:t>ResetPasswordRequest</w:t>
+            </w:r>
+          </w:p>
+        </w:tc>
+        <w:tc>
+          <w:tcPr>
+            <w:tcW w:type="dxa" w:w="6900"/>
+          </w:tcPr>
+          <w:p>
+            <w:r>
+              <w:t>email, code (6 ციფრი), newPassword (min 6)</w:t>
             </w:r>
           </w:p>
         </w:tc>
@@ -28115,17 +28734,8 @@
             <w:vAlign w:val="top"/>
           </w:tcPr>
           <w:p>
-            <w:pPr>
-              <w:spacing w:after="0" w:line="260"/>
-            </w:pPr>
-            <w:r>
-              <w:rPr>
-                <w:rFonts w:ascii="Segoe UI" w:cs="Segoe UI" w:eastAsia="Segoe UI" w:hAnsi="Segoe UI"/>
-                <w:color w:val="22302B"/>
-                <w:sz w:val="17"/>
-                <w:szCs w:val="17"/>
-              </w:rPr>
-              <w:t xml:space="preserve">Required + MaxLength(15) + უნიკალური</w:t>
+            <w:r>
+              <w:t>MaxLength(15) + უნიკალური (სავალდებულო არ არის)</w:t>
             </w:r>
           </w:p>
         </w:tc>
@@ -28142,17 +28752,8 @@
             <w:vAlign w:val="top"/>
           </w:tcPr>
           <w:p>
-            <w:pPr>
-              <w:spacing w:after="0" w:line="260"/>
-            </w:pPr>
-            <w:r>
-              <w:rPr>
-                <w:rFonts w:ascii="Segoe UI" w:cs="Segoe UI" w:eastAsia="Segoe UI" w:hAnsi="Segoe UI"/>
-                <w:color w:val="22302B"/>
-                <w:sz w:val="17"/>
-                <w:szCs w:val="17"/>
-              </w:rPr>
-              <w:t xml:space="preserve">მიკროჩიპის ნომერი სავალდებულოა. / ...15 სიმბოლოს. / მითითებული მიკროჩიპის ნომრით ცხოველი უკვე რეგისტრირებულია.</w:t>
+            <w:r>
+              <w:t>მითითებისას — მაქს. 15 სიმბოლო; დუბლიკატი — 400</w:t>
             </w:r>
           </w:p>
         </w:tc>
@@ -30851,17 +31452,8 @@
             <w:vAlign w:val="top"/>
           </w:tcPr>
           <w:p>
-            <w:pPr>
-              <w:spacing w:after="0" w:line="260"/>
-            </w:pPr>
-            <w:r>
-              <w:rPr>
-                <w:rFonts w:ascii="Segoe UI" w:cs="Segoe UI" w:eastAsia="Segoe UI" w:hAnsi="Segoe UI"/>
-                <w:color w:val="22302B"/>
-                <w:sz w:val="17"/>
-                <w:szCs w:val="17"/>
-              </w:rPr>
-              <w:t xml:space="preserve">AddAuthentication/AddJwtBearer ჩართულია; ყველა endpoint დაცულია register/login-ის გარდა</w:t>
+            <w:r>
+              <w:t>register/login/verify-email/resend-verification/forgot-password/reset-password საჯაროა; დანარჩენი — JWT</w:t>
             </w:r>
           </w:p>
         </w:tc>
@@ -31442,6 +32034,72 @@
                 <w:szCs w:val="17"/>
               </w:rPr>
               <w:t xml:space="preserve">CRUD, მფლობელის სია და დაკარგული ცხოველების სია მუშაობს</w:t>
+            </w:r>
+          </w:p>
+        </w:tc>
+      </w:tr>
+      <w:tr>
+        <w:tc>
+          <w:tcPr>
+            <w:tcW w:type="dxa" w:w="2900"/>
+          </w:tcPr>
+          <w:p>
+            <w:r>
+              <w:t>ელ-ფოსტის ვერიფიკაცია</w:t>
+            </w:r>
+          </w:p>
+        </w:tc>
+        <w:tc>
+          <w:tcPr>
+            <w:tcW w:type="dxa" w:w="6700"/>
+          </w:tcPr>
+          <w:p>
+            <w:r>
+              <w:t>6-ციფრიანი OTP, login დაბლოკილია ვერიფიკაციამდე</w:t>
+            </w:r>
+          </w:p>
+        </w:tc>
+      </w:tr>
+      <w:tr>
+        <w:tc>
+          <w:tcPr>
+            <w:tcW w:type="dxa" w:w="2900"/>
+          </w:tcPr>
+          <w:p>
+            <w:r>
+              <w:t>პაროლის აღდგენა</w:t>
+            </w:r>
+          </w:p>
+        </w:tc>
+        <w:tc>
+          <w:tcPr>
+            <w:tcW w:type="dxa" w:w="6700"/>
+          </w:tcPr>
+          <w:p>
+            <w:r>
+              <w:t>OTP-ით; დროებითი პაროლი არ იგზავნება</w:t>
+            </w:r>
+          </w:p>
+        </w:tc>
+      </w:tr>
+      <w:tr>
+        <w:tc>
+          <w:tcPr>
+            <w:tcW w:type="dxa" w:w="2900"/>
+          </w:tcPr>
+          <w:p>
+            <w:r>
+              <w:t>Pet ფოტოები</w:t>
+            </w:r>
+          </w:p>
+        </w:tc>
+        <w:tc>
+          <w:tcPr>
+            <w:tcW w:type="dxa" w:w="6700"/>
+          </w:tcPr>
+          <w:p>
+            <w:r>
+              <w:t>S3 ატვირთვა/წაშლა/მთავარი ფოტო — მუშაობს</w:t>
             </w:r>
           </w:p>
         </w:tc>
@@ -32278,104 +32936,81 @@
         <w:tc>
           <w:tcPr>
             <w:tcW w:type="dxa" w:w="700"/>
-            <w:tcMar>
-              <w:top w:type="dxa" w:w="70"/>
-              <w:left w:type="dxa" w:w="120"/>
-              <w:bottom w:type="dxa" w:w="70"/>
-              <w:right w:type="dxa" w:w="120"/>
-            </w:tcMar>
-            <w:vAlign w:val="top"/>
-          </w:tcPr>
-          <w:p>
-            <w:pPr>
-              <w:spacing w:after="0" w:line="260"/>
-            </w:pPr>
-            <w:r>
-              <w:rPr>
-                <w:rFonts w:ascii="Segoe UI" w:cs="Segoe UI" w:eastAsia="Segoe UI" w:hAnsi="Segoe UI"/>
-                <w:color w:val="22302B"/>
-                <w:sz w:val="17"/>
-                <w:szCs w:val="17"/>
-              </w:rPr>
-              <w:t xml:space="preserve">R-03</w:t>
+            <w:shd w:fill="F4F8F6" w:val="clear"/>
+            <w:tcMar>
+              <w:top w:type="dxa" w:w="70"/>
+              <w:left w:type="dxa" w:w="120"/>
+              <w:bottom w:type="dxa" w:w="70"/>
+              <w:right w:type="dxa" w:w="120"/>
+            </w:tcMar>
+            <w:vAlign w:val="top"/>
+          </w:tcPr>
+          <w:p>
+            <w:pPr>
+              <w:spacing w:after="0" w:line="260"/>
+            </w:pPr>
+            <w:r>
+              <w:rPr>
+                <w:rFonts w:ascii="Segoe UI" w:cs="Segoe UI" w:eastAsia="Segoe UI" w:hAnsi="Segoe UI"/>
+                <w:color w:val="22302B"/>
+                <w:sz w:val="17"/>
+                <w:szCs w:val="17"/>
+              </w:rPr>
+              <w:t xml:space="preserve">R-04</w:t>
             </w:r>
           </w:p>
         </w:tc>
         <w:tc>
           <w:tcPr>
             <w:tcW w:type="dxa" w:w="3500"/>
-            <w:tcMar>
-              <w:top w:type="dxa" w:w="70"/>
-              <w:left w:type="dxa" w:w="120"/>
-              <w:bottom w:type="dxa" w:w="70"/>
-              <w:right w:type="dxa" w:w="120"/>
-            </w:tcMar>
-            <w:vAlign w:val="top"/>
-          </w:tcPr>
-          <w:p>
-            <w:pPr>
-              <w:spacing w:after="0" w:line="260"/>
-            </w:pPr>
-            <w:r>
-              <w:rPr>
-                <w:rFonts w:ascii="Segoe UI" w:cs="Segoe UI" w:eastAsia="Segoe UI" w:hAnsi="Segoe UI"/>
-                <w:color w:val="22302B"/>
-                <w:sz w:val="17"/>
-                <w:szCs w:val="17"/>
-              </w:rPr>
-              <w:t xml:space="preserve">ელ-ფოსტის ვერიფიკაცია არ არსებობს</w:t>
+            <w:shd w:fill="F4F8F6" w:val="clear"/>
+            <w:tcMar>
+              <w:top w:type="dxa" w:w="70"/>
+              <w:left w:type="dxa" w:w="120"/>
+              <w:bottom w:type="dxa" w:w="70"/>
+              <w:right w:type="dxa" w:w="120"/>
+            </w:tcMar>
+            <w:vAlign w:val="top"/>
+          </w:tcPr>
+          <w:p>
+            <w:r>
+              <w:t>login-ზე rate limiting არ არსებობს</w:t>
             </w:r>
           </w:p>
         </w:tc>
         <w:tc>
           <w:tcPr>
             <w:tcW w:type="dxa" w:w="2700"/>
-            <w:tcMar>
-              <w:top w:type="dxa" w:w="70"/>
-              <w:left w:type="dxa" w:w="120"/>
-              <w:bottom w:type="dxa" w:w="70"/>
-              <w:right w:type="dxa" w:w="120"/>
-            </w:tcMar>
-            <w:vAlign w:val="top"/>
-          </w:tcPr>
-          <w:p>
-            <w:pPr>
-              <w:spacing w:after="0" w:line="260"/>
-            </w:pPr>
-            <w:r>
-              <w:rPr>
-                <w:rFonts w:ascii="Segoe UI" w:cs="Segoe UI" w:eastAsia="Segoe UI" w:hAnsi="Segoe UI"/>
-                <w:color w:val="22302B"/>
-                <w:sz w:val="17"/>
-                <w:szCs w:val="17"/>
-              </w:rPr>
-              <w:t xml:space="preserve">IsVerified ყოველთვის false</w:t>
+            <w:shd w:fill="F4F8F6" w:val="clear"/>
+            <w:tcMar>
+              <w:top w:type="dxa" w:w="70"/>
+              <w:left w:type="dxa" w:w="120"/>
+              <w:bottom w:type="dxa" w:w="70"/>
+              <w:right w:type="dxa" w:w="120"/>
+            </w:tcMar>
+            <w:vAlign w:val="top"/>
+          </w:tcPr>
+          <w:p>
+            <w:r>
+              <w:t>brute-force რისკი login-ზე</w:t>
             </w:r>
           </w:p>
         </w:tc>
         <w:tc>
           <w:tcPr>
             <w:tcW w:type="dxa" w:w="2700"/>
-            <w:tcMar>
-              <w:top w:type="dxa" w:w="70"/>
-              <w:left w:type="dxa" w:w="120"/>
-              <w:bottom w:type="dxa" w:w="70"/>
-              <w:right w:type="dxa" w:w="120"/>
-            </w:tcMar>
-            <w:vAlign w:val="top"/>
-          </w:tcPr>
-          <w:p>
-            <w:pPr>
-              <w:spacing w:after="0" w:line="260"/>
-            </w:pPr>
-            <w:r>
-              <w:rPr>
-                <w:rFonts w:ascii="Segoe UI" w:cs="Segoe UI" w:eastAsia="Segoe UI" w:hAnsi="Segoe UI"/>
-                <w:color w:val="22302B"/>
-                <w:sz w:val="17"/>
-                <w:szCs w:val="17"/>
-              </w:rPr>
-              <w:t xml:space="preserve">ნუ აჩვენებ „დადასტურებულად“</w:t>
+            <w:shd w:fill="F4F8F6" w:val="clear"/>
+            <w:tcMar>
+              <w:top w:type="dxa" w:w="70"/>
+              <w:left w:type="dxa" w:w="120"/>
+              <w:bottom w:type="dxa" w:w="70"/>
+              <w:right w:type="dxa" w:w="120"/>
+            </w:tcMar>
+            <w:vAlign w:val="top"/>
+          </w:tcPr>
+          <w:p>
+            <w:r>
+              <w:t>OTP-ზე limit დანერგილია; login-ზე client-side delay</w:t>
             </w:r>
           </w:p>
         </w:tc>
@@ -32387,217 +33022,146 @@
         <w:tc>
           <w:tcPr>
             <w:tcW w:type="dxa" w:w="700"/>
-            <w:shd w:fill="F4F8F6" w:val="clear"/>
-            <w:tcMar>
-              <w:top w:type="dxa" w:w="70"/>
-              <w:left w:type="dxa" w:w="120"/>
-              <w:bottom w:type="dxa" w:w="70"/>
-              <w:right w:type="dxa" w:w="120"/>
-            </w:tcMar>
-            <w:vAlign w:val="top"/>
-          </w:tcPr>
-          <w:p>
-            <w:pPr>
-              <w:spacing w:after="0" w:line="260"/>
-            </w:pPr>
-            <w:r>
-              <w:rPr>
-                <w:rFonts w:ascii="Segoe UI" w:cs="Segoe UI" w:eastAsia="Segoe UI" w:hAnsi="Segoe UI"/>
-                <w:color w:val="22302B"/>
-                <w:sz w:val="17"/>
-                <w:szCs w:val="17"/>
-              </w:rPr>
-              <w:t xml:space="preserve">R-04</w:t>
+            <w:tcMar>
+              <w:top w:type="dxa" w:w="70"/>
+              <w:left w:type="dxa" w:w="120"/>
+              <w:bottom w:type="dxa" w:w="70"/>
+              <w:right w:type="dxa" w:w="120"/>
+            </w:tcMar>
+            <w:vAlign w:val="top"/>
+          </w:tcPr>
+          <w:p>
+            <w:pPr>
+              <w:spacing w:after="0" w:line="260"/>
+            </w:pPr>
+            <w:r>
+              <w:rPr>
+                <w:rFonts w:ascii="Segoe UI" w:cs="Segoe UI" w:eastAsia="Segoe UI" w:hAnsi="Segoe UI"/>
+                <w:color w:val="22302B"/>
+                <w:sz w:val="17"/>
+                <w:szCs w:val="17"/>
+              </w:rPr>
+              <w:t xml:space="preserve">R-05</w:t>
             </w:r>
           </w:p>
         </w:tc>
         <w:tc>
           <w:tcPr>
             <w:tcW w:type="dxa" w:w="3500"/>
-            <w:shd w:fill="F4F8F6" w:val="clear"/>
-            <w:tcMar>
-              <w:top w:type="dxa" w:w="70"/>
-              <w:left w:type="dxa" w:w="120"/>
-              <w:bottom w:type="dxa" w:w="70"/>
-              <w:right w:type="dxa" w:w="120"/>
-            </w:tcMar>
-            <w:vAlign w:val="top"/>
-          </w:tcPr>
-          <w:p>
-            <w:pPr>
-              <w:spacing w:after="0" w:line="260"/>
-            </w:pPr>
-            <w:r>
-              <w:rPr>
-                <w:rFonts w:ascii="Segoe UI" w:cs="Segoe UI" w:eastAsia="Segoe UI" w:hAnsi="Segoe UI"/>
-                <w:color w:val="22302B"/>
-                <w:sz w:val="17"/>
-                <w:szCs w:val="17"/>
-              </w:rPr>
-              <w:t xml:space="preserve">Rate limiting არ არსებობს</w:t>
+            <w:tcMar>
+              <w:top w:type="dxa" w:w="70"/>
+              <w:left w:type="dxa" w:w="120"/>
+              <w:bottom w:type="dxa" w:w="70"/>
+              <w:right w:type="dxa" w:w="120"/>
+            </w:tcMar>
+            <w:vAlign w:val="top"/>
+          </w:tcPr>
+          <w:p>
+            <w:pPr>
+              <w:spacing w:after="0" w:line="260"/>
+            </w:pPr>
+            <w:r>
+              <w:rPr>
+                <w:rFonts w:ascii="Segoe UI" w:cs="Segoe UI" w:eastAsia="Segoe UI" w:hAnsi="Segoe UI"/>
+                <w:color w:val="22302B"/>
+                <w:sz w:val="17"/>
+                <w:szCs w:val="17"/>
+              </w:rPr>
+              <w:t xml:space="preserve">მომხმარებლების სია/ძებნა არ არსებობს</w:t>
             </w:r>
           </w:p>
         </w:tc>
         <w:tc>
           <w:tcPr>
             <w:tcW w:type="dxa" w:w="2700"/>
-            <w:shd w:fill="F4F8F6" w:val="clear"/>
-            <w:tcMar>
-              <w:top w:type="dxa" w:w="70"/>
-              <w:left w:type="dxa" w:w="120"/>
-              <w:bottom w:type="dxa" w:w="70"/>
-              <w:right w:type="dxa" w:w="120"/>
-            </w:tcMar>
-            <w:vAlign w:val="top"/>
-          </w:tcPr>
-          <w:p>
-            <w:pPr>
-              <w:spacing w:after="0" w:line="260"/>
-            </w:pPr>
-            <w:r>
-              <w:rPr>
-                <w:rFonts w:ascii="Segoe UI" w:cs="Segoe UI" w:eastAsia="Segoe UI" w:hAnsi="Segoe UI"/>
-                <w:color w:val="22302B"/>
-                <w:sz w:val="17"/>
-                <w:szCs w:val="17"/>
-              </w:rPr>
-              <w:t xml:space="preserve">brute-force რისკი</w:t>
+            <w:tcMar>
+              <w:top w:type="dxa" w:w="70"/>
+              <w:left w:type="dxa" w:w="120"/>
+              <w:bottom w:type="dxa" w:w="70"/>
+              <w:right w:type="dxa" w:w="120"/>
+            </w:tcMar>
+            <w:vAlign w:val="top"/>
+          </w:tcPr>
+          <w:p>
+            <w:pPr>
+              <w:spacing w:after="0" w:line="260"/>
+            </w:pPr>
+            <w:r>
+              <w:rPr>
+                <w:rFonts w:ascii="Segoe UI" w:cs="Segoe UI" w:eastAsia="Segoe UI" w:hAnsi="Segoe UI"/>
+                <w:color w:val="22302B"/>
+                <w:sz w:val="17"/>
+                <w:szCs w:val="17"/>
+              </w:rPr>
+              <w:t xml:space="preserve">ადმინის ეკრანი ვერ აშენდება</w:t>
             </w:r>
           </w:p>
         </w:tc>
         <w:tc>
           <w:tcPr>
             <w:tcW w:type="dxa" w:w="2700"/>
-            <w:shd w:fill="F4F8F6" w:val="clear"/>
-            <w:tcMar>
-              <w:top w:type="dxa" w:w="70"/>
-              <w:left w:type="dxa" w:w="120"/>
-              <w:bottom w:type="dxa" w:w="70"/>
-              <w:right w:type="dxa" w:w="120"/>
-            </w:tcMar>
-            <w:vAlign w:val="top"/>
-          </w:tcPr>
-          <w:p>
-            <w:pPr>
-              <w:spacing w:after="0" w:line="260"/>
-            </w:pPr>
-            <w:r>
-              <w:rPr>
-                <w:rFonts w:ascii="Segoe UI" w:cs="Segoe UI" w:eastAsia="Segoe UI" w:hAnsi="Segoe UI"/>
-                <w:color w:val="22302B"/>
-                <w:sz w:val="17"/>
-                <w:szCs w:val="17"/>
-              </w:rPr>
-              <w:t xml:space="preserve">login-ზე client-side delay</w:t>
+            <w:tcMar>
+              <w:top w:type="dxa" w:w="70"/>
+              <w:left w:type="dxa" w:w="120"/>
+              <w:bottom w:type="dxa" w:w="70"/>
+              <w:right w:type="dxa" w:w="120"/>
+            </w:tcMar>
+            <w:vAlign w:val="top"/>
+          </w:tcPr>
+          <w:p>
+            <w:pPr>
+              <w:spacing w:after="0" w:line="260"/>
+            </w:pPr>
+            <w:r>
+              <w:rPr>
+                <w:rFonts w:ascii="Segoe UI" w:cs="Segoe UI" w:eastAsia="Segoe UI" w:hAnsi="Segoe UI"/>
+                <w:color w:val="22302B"/>
+                <w:sz w:val="17"/>
+                <w:szCs w:val="17"/>
+              </w:rPr>
+              <w:t xml:space="preserve">დაელოდე backend-ს</w:t>
             </w:r>
           </w:p>
         </w:tc>
       </w:tr>
       <w:tr>
-        <w:trPr>
-          <w:cantSplit/>
-        </w:trPr>
         <w:tc>
           <w:tcPr>
             <w:tcW w:type="dxa" w:w="700"/>
-            <w:tcMar>
-              <w:top w:type="dxa" w:w="70"/>
-              <w:left w:type="dxa" w:w="120"/>
-              <w:bottom w:type="dxa" w:w="70"/>
-              <w:right w:type="dxa" w:w="120"/>
-            </w:tcMar>
-            <w:vAlign w:val="top"/>
-          </w:tcPr>
-          <w:p>
-            <w:pPr>
-              <w:spacing w:after="0" w:line="260"/>
-            </w:pPr>
-            <w:r>
-              <w:rPr>
-                <w:rFonts w:ascii="Segoe UI" w:cs="Segoe UI" w:eastAsia="Segoe UI" w:hAnsi="Segoe UI"/>
-                <w:color w:val="22302B"/>
-                <w:sz w:val="17"/>
-                <w:szCs w:val="17"/>
-              </w:rPr>
-              <w:t xml:space="preserve">R-05</w:t>
+          </w:tcPr>
+          <w:p>
+            <w:r>
+              <w:t>K-10</w:t>
             </w:r>
           </w:p>
         </w:tc>
         <w:tc>
           <w:tcPr>
             <w:tcW w:type="dxa" w:w="3500"/>
-            <w:tcMar>
-              <w:top w:type="dxa" w:w="70"/>
-              <w:left w:type="dxa" w:w="120"/>
-              <w:bottom w:type="dxa" w:w="70"/>
-              <w:right w:type="dxa" w:w="120"/>
-            </w:tcMar>
-            <w:vAlign w:val="top"/>
-          </w:tcPr>
-          <w:p>
-            <w:pPr>
-              <w:spacing w:after="0" w:line="260"/>
-            </w:pPr>
-            <w:r>
-              <w:rPr>
-                <w:rFonts w:ascii="Segoe UI" w:cs="Segoe UI" w:eastAsia="Segoe UI" w:hAnsi="Segoe UI"/>
-                <w:color w:val="22302B"/>
-                <w:sz w:val="17"/>
-                <w:szCs w:val="17"/>
-              </w:rPr>
-              <w:t xml:space="preserve">მომხმარებლების სია/ძებნა არ არსებობს</w:t>
+          </w:tcPr>
+          <w:p>
+            <w:r>
+              <w:t>SMTP კონფიგურაცია აუცილებელია</w:t>
             </w:r>
           </w:p>
         </w:tc>
         <w:tc>
           <w:tcPr>
             <w:tcW w:type="dxa" w:w="2700"/>
-            <w:tcMar>
-              <w:top w:type="dxa" w:w="70"/>
-              <w:left w:type="dxa" w:w="120"/>
-              <w:bottom w:type="dxa" w:w="70"/>
-              <w:right w:type="dxa" w:w="120"/>
-            </w:tcMar>
-            <w:vAlign w:val="top"/>
-          </w:tcPr>
-          <w:p>
-            <w:pPr>
-              <w:spacing w:after="0" w:line="260"/>
-            </w:pPr>
-            <w:r>
-              <w:rPr>
-                <w:rFonts w:ascii="Segoe UI" w:cs="Segoe UI" w:eastAsia="Segoe UI" w:hAnsi="Segoe UI"/>
-                <w:color w:val="22302B"/>
-                <w:sz w:val="17"/>
-                <w:szCs w:val="17"/>
-              </w:rPr>
-              <w:t xml:space="preserve">ადმინის ეკრანი ვერ აშენდება</w:t>
+          </w:tcPr>
+          <w:p>
+            <w:r>
+              <w:t>OTP email არ გაიგზავნება კონფიგურაციის გარეშე</w:t>
             </w:r>
           </w:p>
         </w:tc>
         <w:tc>
           <w:tcPr>
             <w:tcW w:type="dxa" w:w="2700"/>
-            <w:tcMar>
-              <w:top w:type="dxa" w:w="70"/>
-              <w:left w:type="dxa" w:w="120"/>
-              <w:bottom w:type="dxa" w:w="70"/>
-              <w:right w:type="dxa" w:w="120"/>
-            </w:tcMar>
-            <w:vAlign w:val="top"/>
-          </w:tcPr>
-          <w:p>
-            <w:pPr>
-              <w:spacing w:after="0" w:line="260"/>
-            </w:pPr>
-            <w:r>
-              <w:rPr>
-                <w:rFonts w:ascii="Segoe UI" w:cs="Segoe UI" w:eastAsia="Segoe UI" w:hAnsi="Segoe UI"/>
-                <w:color w:val="22302B"/>
-                <w:sz w:val="17"/>
-                <w:szCs w:val="17"/>
-              </w:rPr>
-              <w:t xml:space="preserve">დაელოდე backend-ს</w:t>
+          </w:tcPr>
+          <w:p>
+            <w:r>
+              <w:t>შეავსე Email:* ან environment variables</w:t>
             </w:r>
           </w:p>
         </w:tc>
@@ -33959,7 +34523,7 @@
                 <w:sz w:val="15"/>
                 <w:szCs w:val="15"/>
               </w:rPr>
-              <w:t xml:space="preserve">  id: string;</w:t>
+              <w:t xml:space="preserve">  id: number;</w:t>
             </w:r>
           </w:p>
           <w:p>
@@ -34071,7 +34635,17 @@
                 <w:sz w:val="15"/>
                 <w:szCs w:val="15"/>
               </w:rPr>
-              <w:t xml:space="preserve">  isVerified: boolean;</w:t>
+              <w:t xml:space="preserve">  isEmailVerified: boolean;</w:t>
+            </w:r>
+          </w:p>
+          <w:p>
+            <w:pPr/>
+            <w:r>
+              <w:rPr>
+                <w:rFonts w:ascii="Consolas" w:hAnsi="Consolas"/>
+                <w:sz w:val="15"/>
+              </w:rPr>
+              <w:t xml:space="preserve">  emailVerifiedAt: string | null;</w:t>
             </w:r>
           </w:p>
           <w:p>
@@ -34229,6 +34803,16 @@
             </w:r>
           </w:p>
           <w:p>
+            <w:pPr/>
+            <w:r>
+              <w:rPr>
+                <w:rFonts w:ascii="Consolas" w:hAnsi="Consolas"/>
+                <w:sz w:val="15"/>
+              </w:rPr>
+              <w:t xml:space="preserve">  isEmailVerified: boolean;</w:t>
+            </w:r>
+          </w:p>
+          <w:p>
             <w:pPr>
               <w:spacing w:after="0" w:line="240"/>
             </w:pPr>
@@ -34323,7 +34907,7 @@
                 <w:sz w:val="15"/>
                 <w:szCs w:val="15"/>
               </w:rPr>
-              <w:t xml:space="preserve">  id: string;</w:t>
+              <w:t xml:space="preserve">  id: number;</w:t>
             </w:r>
           </w:p>
           <w:p>
@@ -34337,7 +34921,7 @@
                 <w:sz w:val="15"/>
                 <w:szCs w:val="15"/>
               </w:rPr>
-              <w:t xml:space="preserve">  ownerId: string;</w:t>
+              <w:t xml:space="preserve">  ownerId: number;</w:t>
             </w:r>
           </w:p>
           <w:p>
@@ -34864,7 +35448,7 @@
                 <w:sz w:val="15"/>
                 <w:szCs w:val="15"/>
               </w:rPr>
-              <w:t xml:space="preserve">  listMine: (ownerId: string) =&gt;</w:t>
+              <w:t xml:space="preserve">  listMine: (ownerId: number) =&gt;</w:t>
             </w:r>
           </w:p>
           <w:p>
@@ -34906,7 +35490,7 @@
                 <w:sz w:val="15"/>
                 <w:szCs w:val="15"/>
               </w:rPr>
-              <w:t xml:space="preserve">  get: (id: string) =&gt; api&lt;PetResponse&gt;(`/api/v1/pet/${id}`),</w:t>
+              <w:t xml:space="preserve">  get: (id: number) =&gt; api&lt;PetResponse&gt;(`/api/v1/pet/${id}`),</w:t>
             </w:r>
           </w:p>
           <w:p>
@@ -34990,7 +35574,7 @@
                 <w:sz w:val="15"/>
                 <w:szCs w:val="15"/>
               </w:rPr>
-              <w:t xml:space="preserve">  update: (id: string, data: PetRequest) =&gt;</w:t>
+              <w:t xml:space="preserve">  update: (id: number, data: PetRequest) =&gt;</w:t>
             </w:r>
           </w:p>
           <w:p>
@@ -35060,7 +35644,7 @@
                 <w:sz w:val="15"/>
                 <w:szCs w:val="15"/>
               </w:rPr>
-              <w:t xml:space="preserve">  remove: (id: string) =&gt;</w:t>
+              <w:t xml:space="preserve">  remove: (id: number) =&gt;</w:t>
             </w:r>
           </w:p>
           <w:p>
@@ -35527,17 +36111,8 @@
             <w:vAlign w:val="top"/>
           </w:tcPr>
           <w:p>
-            <w:pPr>
-              <w:spacing w:after="0" w:line="260"/>
-            </w:pPr>
-            <w:r>
-              <w:rPr>
-                <w:rFonts w:ascii="Segoe UI" w:cs="Segoe UI" w:eastAsia="Segoe UI" w:hAnsi="Segoe UI"/>
-                <w:color w:val="22302B"/>
-                <w:sz w:val="17"/>
-                <w:szCs w:val="17"/>
-              </w:rPr>
-              <w:t xml:space="preserve">POST /auth/login</w:t>
+            <w:r>
+              <w:t>POST /auth/login (მხოლოდ verified)</w:t>
             </w:r>
           </w:p>
         </w:tc>
@@ -35640,17 +36215,134 @@
             <w:vAlign w:val="top"/>
           </w:tcPr>
           <w:p>
-            <w:pPr>
-              <w:spacing w:after="0" w:line="260"/>
-            </w:pPr>
-            <w:r>
-              <w:rPr>
-                <w:rFonts w:ascii="Segoe UI" w:cs="Segoe UI" w:eastAsia="Segoe UI" w:hAnsi="Segoe UI"/>
-                <w:color w:val="22302B"/>
-                <w:sz w:val="17"/>
-                <w:szCs w:val="17"/>
-              </w:rPr>
-              <w:t xml:space="preserve">POST /user/add-user + login</w:t>
+            <w:r>
+              <w:t>POST /user/add-user → /verify-email</w:t>
+            </w:r>
+          </w:p>
+        </w:tc>
+      </w:tr>
+      <w:tr>
+        <w:tc>
+          <w:tcPr>
+            <w:tcW w:type="dxa" w:w="1800"/>
+          </w:tcPr>
+          <w:p>
+            <w:r>
+              <w:t>/verify-email</w:t>
+            </w:r>
+          </w:p>
+        </w:tc>
+        <w:tc>
+          <w:tcPr>
+            <w:tcW w:type="dxa" w:w="3400"/>
+          </w:tcPr>
+          <w:p>
+            <w:r>
+              <w:t>ელ-ფოსტის დადასტურება</w:t>
+            </w:r>
+          </w:p>
+        </w:tc>
+        <w:tc>
+          <w:tcPr>
+            <w:tcW w:type="dxa" w:w="2500"/>
+          </w:tcPr>
+          <w:p>
+            <w:r>
+              <w:t>სტუმარი</w:t>
+            </w:r>
+          </w:p>
+        </w:tc>
+        <w:tc>
+          <w:tcPr>
+            <w:tcW w:type="dxa" w:w="1900"/>
+          </w:tcPr>
+          <w:p>
+            <w:r>
+              <w:t>POST /auth/verify-email</w:t>
+            </w:r>
+          </w:p>
+        </w:tc>
+      </w:tr>
+      <w:tr>
+        <w:tc>
+          <w:tcPr>
+            <w:tcW w:type="dxa" w:w="1800"/>
+          </w:tcPr>
+          <w:p>
+            <w:r>
+              <w:t>/forgot-password</w:t>
+            </w:r>
+          </w:p>
+        </w:tc>
+        <w:tc>
+          <w:tcPr>
+            <w:tcW w:type="dxa" w:w="3400"/>
+          </w:tcPr>
+          <w:p>
+            <w:r>
+              <w:t>პაროლის აღდგენის მოთხოვნა</w:t>
+            </w:r>
+          </w:p>
+        </w:tc>
+        <w:tc>
+          <w:tcPr>
+            <w:tcW w:type="dxa" w:w="2500"/>
+          </w:tcPr>
+          <w:p>
+            <w:r>
+              <w:t>სტუმარი</w:t>
+            </w:r>
+          </w:p>
+        </w:tc>
+        <w:tc>
+          <w:tcPr>
+            <w:tcW w:type="dxa" w:w="1900"/>
+          </w:tcPr>
+          <w:p>
+            <w:r>
+              <w:t>POST /auth/forgot-password</w:t>
+            </w:r>
+          </w:p>
+        </w:tc>
+      </w:tr>
+      <w:tr>
+        <w:tc>
+          <w:tcPr>
+            <w:tcW w:type="dxa" w:w="1800"/>
+          </w:tcPr>
+          <w:p>
+            <w:r>
+              <w:t>/reset-password</w:t>
+            </w:r>
+          </w:p>
+        </w:tc>
+        <w:tc>
+          <w:tcPr>
+            <w:tcW w:type="dxa" w:w="3400"/>
+          </w:tcPr>
+          <w:p>
+            <w:r>
+              <w:t>ახალი პაროლი OTP-ით</w:t>
+            </w:r>
+          </w:p>
+        </w:tc>
+        <w:tc>
+          <w:tcPr>
+            <w:tcW w:type="dxa" w:w="2500"/>
+          </w:tcPr>
+          <w:p>
+            <w:r>
+              <w:t>სტუმარი</w:t>
+            </w:r>
+          </w:p>
+        </w:tc>
+        <w:tc>
+          <w:tcPr>
+            <w:tcW w:type="dxa" w:w="1900"/>
+          </w:tcPr>
+          <w:p>
+            <w:r>
+              <w:t>POST /auth/reset-password</w:t>
             </w:r>
           </w:p>
         </w:tc>
@@ -38166,17 +38858,8 @@
             <w:vAlign w:val="top"/>
           </w:tcPr>
           <w:p>
-            <w:pPr>
-              <w:spacing w:after="0" w:line="260"/>
-            </w:pPr>
-            <w:r>
-              <w:rPr>
-                <w:rFonts w:ascii="Segoe UI" w:cs="Segoe UI" w:eastAsia="Segoe UI" w:hAnsi="Segoe UI"/>
-                <w:color w:val="22302B"/>
-                <w:sz w:val="17"/>
-                <w:szCs w:val="17"/>
-              </w:rPr>
-              <w:t xml:space="preserve">რეგისტრაცია სწორი მონაცემებით</w:t>
+            <w:r>
+              <w:t>რეგისტრაცია სწორი მონაცემებით</w:t>
             </w:r>
           </w:p>
         </w:tc>
@@ -38192,17 +38875,8 @@
             <w:vAlign w:val="top"/>
           </w:tcPr>
           <w:p>
-            <w:pPr>
-              <w:spacing w:after="0" w:line="260"/>
-            </w:pPr>
-            <w:r>
-              <w:rPr>
-                <w:rFonts w:ascii="Segoe UI" w:cs="Segoe UI" w:eastAsia="Segoe UI" w:hAnsi="Segoe UI"/>
-                <w:color w:val="22302B"/>
-                <w:sz w:val="17"/>
-                <w:szCs w:val="17"/>
-              </w:rPr>
-              <w:t xml:space="preserve">201, ავტომატური login, /profile</w:t>
+            <w:r>
+              <w:t>201, isEmailVerified=false, redirect /verify-email</w:t>
             </w:r>
           </w:p>
         </w:tc>
@@ -39979,6 +40653,198 @@
                 <w:szCs w:val="17"/>
               </w:rPr>
               <w:t xml:space="preserve">204, შემდეგ 404</w:t>
+            </w:r>
+          </w:p>
+        </w:tc>
+      </w:tr>
+      <w:tr>
+        <w:tc>
+          <w:tcPr>
+            <w:tcW w:type="dxa" w:w="800"/>
+          </w:tcPr>
+          <w:p>
+            <w:r>
+              <w:t>T-23</w:t>
+            </w:r>
+          </w:p>
+        </w:tc>
+        <w:tc>
+          <w:tcPr>
+            <w:tcW w:type="dxa" w:w="4600"/>
+          </w:tcPr>
+          <w:p>
+            <w:r>
+              <w:t>login დაუდასტურებელი email-ით</w:t>
+            </w:r>
+          </w:p>
+        </w:tc>
+        <w:tc>
+          <w:tcPr>
+            <w:tcW w:type="dxa" w:w="4200"/>
+          </w:tcPr>
+          <w:p>
+            <w:r>
+              <w:t>403 EMAIL_NOT_VERIFIED, redirect /verify-email</w:t>
+            </w:r>
+          </w:p>
+        </w:tc>
+      </w:tr>
+      <w:tr>
+        <w:tc>
+          <w:tcPr>
+            <w:tcW w:type="dxa" w:w="800"/>
+          </w:tcPr>
+          <w:p>
+            <w:r>
+              <w:t>T-24</w:t>
+            </w:r>
+          </w:p>
+        </w:tc>
+        <w:tc>
+          <w:tcPr>
+            <w:tcW w:type="dxa" w:w="4600"/>
+          </w:tcPr>
+          <w:p>
+            <w:r>
+              <w:t>verify-email სწორი OTP-ით</w:t>
+            </w:r>
+          </w:p>
+        </w:tc>
+        <w:tc>
+          <w:tcPr>
+            <w:tcW w:type="dxa" w:w="4200"/>
+          </w:tcPr>
+          <w:p>
+            <w:r>
+              <w:t>200, login შესაძლებელია</w:t>
+            </w:r>
+          </w:p>
+        </w:tc>
+      </w:tr>
+      <w:tr>
+        <w:tc>
+          <w:tcPr>
+            <w:tcW w:type="dxa" w:w="800"/>
+          </w:tcPr>
+          <w:p>
+            <w:r>
+              <w:t>T-25</w:t>
+            </w:r>
+          </w:p>
+        </w:tc>
+        <w:tc>
+          <w:tcPr>
+            <w:tcW w:type="dxa" w:w="4600"/>
+          </w:tcPr>
+          <w:p>
+            <w:r>
+              <w:t>verify-email არასწორი OTP 5-ჯერ</w:t>
+            </w:r>
+          </w:p>
+        </w:tc>
+        <w:tc>
+          <w:tcPr>
+            <w:tcW w:type="dxa" w:w="4200"/>
+          </w:tcPr>
+          <w:p>
+            <w:r>
+              <w:t>400, კოდი იბლოკება</w:t>
+            </w:r>
+          </w:p>
+        </w:tc>
+      </w:tr>
+      <w:tr>
+        <w:tc>
+          <w:tcPr>
+            <w:tcW w:type="dxa" w:w="800"/>
+          </w:tcPr>
+          <w:p>
+            <w:r>
+              <w:t>T-26</w:t>
+            </w:r>
+          </w:p>
+        </w:tc>
+        <w:tc>
+          <w:tcPr>
+            <w:tcW w:type="dxa" w:w="4600"/>
+          </w:tcPr>
+          <w:p>
+            <w:r>
+              <w:t>resend-verification 60 წმ-ზე ადრე</w:t>
+            </w:r>
+          </w:p>
+        </w:tc>
+        <w:tc>
+          <w:tcPr>
+            <w:tcW w:type="dxa" w:w="4200"/>
+          </w:tcPr>
+          <w:p>
+            <w:r>
+              <w:t>200 generic, ახალი წერილი არ იგზავნება</w:t>
+            </w:r>
+          </w:p>
+        </w:tc>
+      </w:tr>
+      <w:tr>
+        <w:tc>
+          <w:tcPr>
+            <w:tcW w:type="dxa" w:w="800"/>
+          </w:tcPr>
+          <w:p>
+            <w:r>
+              <w:t>T-27</w:t>
+            </w:r>
+          </w:p>
+        </w:tc>
+        <w:tc>
+          <w:tcPr>
+            <w:tcW w:type="dxa" w:w="4600"/>
+          </w:tcPr>
+          <w:p>
+            <w:r>
+              <w:t>forgot-password → reset-password</w:t>
+            </w:r>
+          </w:p>
+        </w:tc>
+        <w:tc>
+          <w:tcPr>
+            <w:tcW w:type="dxa" w:w="4200"/>
+          </w:tcPr>
+          <w:p>
+            <w:r>
+              <w:t>200, ახალი პაროლი მუშაობს, ძველი — 401</w:t>
+            </w:r>
+          </w:p>
+        </w:tc>
+      </w:tr>
+      <w:tr>
+        <w:tc>
+          <w:tcPr>
+            <w:tcW w:type="dxa" w:w="800"/>
+          </w:tcPr>
+          <w:p>
+            <w:r>
+              <w:t>T-28</w:t>
+            </w:r>
+          </w:p>
+        </w:tc>
+        <w:tc>
+          <w:tcPr>
+            <w:tcW w:type="dxa" w:w="4600"/>
+          </w:tcPr>
+          <w:p>
+            <w:r>
+              <w:t>OTP endpoint-ები token-ის გარეშე</w:t>
+            </w:r>
+          </w:p>
+        </w:tc>
+        <w:tc>
+          <w:tcPr>
+            <w:tcW w:type="dxa" w:w="4200"/>
+          </w:tcPr>
+          <w:p>
+            <w:r>
+              <w:t>200/400, 401 არა</w:t>
             </w:r>
           </w:p>
         </w:tc>
@@ -40501,6 +41367,7 @@
         <w:tc>
           <w:tcPr>
             <w:tcW w:type="dxa" w:w="1650"/>
+            <w:shd w:fill="F4F8F6" w:val="clear"/>
             <w:tcMar>
               <w:top w:type="dxa" w:w="70"/>
               <w:left w:type="dxa" w:w="120"/>
@@ -40527,78 +41394,81 @@
         <w:tc>
           <w:tcPr>
             <w:tcW w:type="dxa" w:w="2950"/>
-            <w:tcMar>
-              <w:top w:type="dxa" w:w="70"/>
-              <w:left w:type="dxa" w:w="120"/>
-              <w:bottom w:type="dxa" w:w="70"/>
-              <w:right w:type="dxa" w:w="120"/>
-            </w:tcMar>
-            <w:vAlign w:val="top"/>
-          </w:tcPr>
-          <w:p>
-            <w:pPr>
-              <w:spacing w:after="0" w:line="260"/>
-            </w:pPr>
-            <w:r>
-              <w:rPr>
-                <w:rFonts w:ascii="Segoe UI" w:cs="Segoe UI" w:eastAsia="Segoe UI" w:hAnsi="Segoe UI"/>
-                <w:color w:val="22302B"/>
-                <w:sz w:val="17"/>
-                <w:szCs w:val="17"/>
-              </w:rPr>
-              <w:t xml:space="preserve">ცხოველის ფოტოები</w:t>
+            <w:shd w:fill="F4F8F6" w:val="clear"/>
+            <w:tcMar>
+              <w:top w:type="dxa" w:w="70"/>
+              <w:left w:type="dxa" w:w="120"/>
+              <w:bottom w:type="dxa" w:w="70"/>
+              <w:right w:type="dxa" w:w="120"/>
+            </w:tcMar>
+            <w:vAlign w:val="top"/>
+          </w:tcPr>
+          <w:p>
+            <w:pPr>
+              <w:spacing w:after="0" w:line="260"/>
+            </w:pPr>
+            <w:r>
+              <w:rPr>
+                <w:rFonts w:ascii="Segoe UI" w:cs="Segoe UI" w:eastAsia="Segoe UI" w:hAnsi="Segoe UI"/>
+                <w:color w:val="22302B"/>
+                <w:sz w:val="17"/>
+                <w:szCs w:val="17"/>
+              </w:rPr>
+              <w:t xml:space="preserve">სამედიცინო ჩანაწერები / ვაქცინაცია</w:t>
             </w:r>
           </w:p>
         </w:tc>
         <w:tc>
           <w:tcPr>
             <w:tcW w:type="dxa" w:w="2850"/>
-            <w:tcMar>
-              <w:top w:type="dxa" w:w="70"/>
-              <w:left w:type="dxa" w:w="120"/>
-              <w:bottom w:type="dxa" w:w="70"/>
-              <w:right w:type="dxa" w:w="120"/>
-            </w:tcMar>
-            <w:vAlign w:val="top"/>
-          </w:tcPr>
-          <w:p>
-            <w:pPr>
-              <w:spacing w:after="0" w:line="260"/>
-            </w:pPr>
-            <w:r>
-              <w:rPr>
-                <w:rFonts w:ascii="Segoe UI" w:cs="Segoe UI" w:eastAsia="Segoe UI" w:hAnsi="Segoe UI"/>
-                <w:color w:val="22302B"/>
-                <w:sz w:val="17"/>
-                <w:szCs w:val="17"/>
-              </w:rPr>
-              <w:t xml:space="preserve">POST /pets/{id}/photos (multipart)</w:t>
+            <w:shd w:fill="F4F8F6" w:val="clear"/>
+            <w:tcMar>
+              <w:top w:type="dxa" w:w="70"/>
+              <w:left w:type="dxa" w:w="120"/>
+              <w:bottom w:type="dxa" w:w="70"/>
+              <w:right w:type="dxa" w:w="120"/>
+            </w:tcMar>
+            <w:vAlign w:val="top"/>
+          </w:tcPr>
+          <w:p>
+            <w:pPr>
+              <w:spacing w:after="0" w:line="260"/>
+            </w:pPr>
+            <w:r>
+              <w:rPr>
+                <w:rFonts w:ascii="Segoe UI" w:cs="Segoe UI" w:eastAsia="Segoe UI" w:hAnsi="Segoe UI"/>
+                <w:color w:val="22302B"/>
+                <w:sz w:val="17"/>
+                <w:szCs w:val="17"/>
+              </w:rPr>
+              <w:t xml:space="preserve">GET/POST /pets/{id}/medical-records</w:t>
             </w:r>
           </w:p>
         </w:tc>
         <w:tc>
           <w:tcPr>
             <w:tcW w:type="dxa" w:w="2150"/>
-            <w:tcMar>
-              <w:top w:type="dxa" w:w="70"/>
-              <w:left w:type="dxa" w:w="120"/>
-              <w:bottom w:type="dxa" w:w="70"/>
-              <w:right w:type="dxa" w:w="120"/>
-            </w:tcMar>
-            <w:vAlign w:val="top"/>
-          </w:tcPr>
-          <w:p>
-            <w:pPr>
-              <w:spacing w:after="0" w:line="260"/>
-            </w:pPr>
-            <w:r>
-              <w:rPr>
-                <w:rFonts w:ascii="Segoe UI" w:cs="Segoe UI" w:eastAsia="Segoe UI" w:hAnsi="Segoe UI"/>
-                <w:color w:val="22302B"/>
-                <w:sz w:val="17"/>
-                <w:szCs w:val="17"/>
-              </w:rPr>
-              <w:t xml:space="preserve">ახალი upload კომპონენტი</w:t>
+            <w:shd w:fill="F4F8F6" w:val="clear"/>
+            <w:tcMar>
+              <w:top w:type="dxa" w:w="70"/>
+              <w:left w:type="dxa" w:w="120"/>
+              <w:bottom w:type="dxa" w:w="70"/>
+              <w:right w:type="dxa" w:w="120"/>
+            </w:tcMar>
+            <w:vAlign w:val="top"/>
+          </w:tcPr>
+          <w:p>
+            <w:pPr>
+              <w:spacing w:after="0" w:line="260"/>
+            </w:pPr>
+            <w:r>
+              <w:rPr>
+                <w:rFonts w:ascii="Segoe UI" w:cs="Segoe UI" w:eastAsia="Segoe UI" w:hAnsi="Segoe UI"/>
+                <w:color w:val="22302B"/>
+                <w:sz w:val="17"/>
+                <w:szCs w:val="17"/>
+              </w:rPr>
+              <w:t xml:space="preserve">დეტალების ახალი tab</w:t>
             </w:r>
           </w:p>
         </w:tc>
@@ -40610,7 +41480,6 @@
         <w:tc>
           <w:tcPr>
             <w:tcW w:type="dxa" w:w="1650"/>
-            <w:shd w:fill="F4F8F6" w:val="clear"/>
             <w:tcMar>
               <w:top w:type="dxa" w:w="70"/>
               <w:left w:type="dxa" w:w="120"/>
@@ -40637,81 +41506,78 @@
         <w:tc>
           <w:tcPr>
             <w:tcW w:type="dxa" w:w="2950"/>
-            <w:shd w:fill="F4F8F6" w:val="clear"/>
-            <w:tcMar>
-              <w:top w:type="dxa" w:w="70"/>
-              <w:left w:type="dxa" w:w="120"/>
-              <w:bottom w:type="dxa" w:w="70"/>
-              <w:right w:type="dxa" w:w="120"/>
-            </w:tcMar>
-            <w:vAlign w:val="top"/>
-          </w:tcPr>
-          <w:p>
-            <w:pPr>
-              <w:spacing w:after="0" w:line="260"/>
-            </w:pPr>
-            <w:r>
-              <w:rPr>
-                <w:rFonts w:ascii="Segoe UI" w:cs="Segoe UI" w:eastAsia="Segoe UI" w:hAnsi="Segoe UI"/>
-                <w:color w:val="22302B"/>
-                <w:sz w:val="17"/>
-                <w:szCs w:val="17"/>
-              </w:rPr>
-              <w:t xml:space="preserve">სამედიცინო ჩანაწერები / ვაქცინაცია</w:t>
+            <w:tcMar>
+              <w:top w:type="dxa" w:w="70"/>
+              <w:left w:type="dxa" w:w="120"/>
+              <w:bottom w:type="dxa" w:w="70"/>
+              <w:right w:type="dxa" w:w="120"/>
+            </w:tcMar>
+            <w:vAlign w:val="top"/>
+          </w:tcPr>
+          <w:p>
+            <w:pPr>
+              <w:spacing w:after="0" w:line="260"/>
+            </w:pPr>
+            <w:r>
+              <w:rPr>
+                <w:rFonts w:ascii="Segoe UI" w:cs="Segoe UI" w:eastAsia="Segoe UI" w:hAnsi="Segoe UI"/>
+                <w:color w:val="22302B"/>
+                <w:sz w:val="17"/>
+                <w:szCs w:val="17"/>
+              </w:rPr>
+              <w:t xml:space="preserve">Pagination / ფილტრები</w:t>
             </w:r>
           </w:p>
         </w:tc>
         <w:tc>
           <w:tcPr>
             <w:tcW w:type="dxa" w:w="2850"/>
-            <w:shd w:fill="F4F8F6" w:val="clear"/>
-            <w:tcMar>
-              <w:top w:type="dxa" w:w="70"/>
-              <w:left w:type="dxa" w:w="120"/>
-              <w:bottom w:type="dxa" w:w="70"/>
-              <w:right w:type="dxa" w:w="120"/>
-            </w:tcMar>
-            <w:vAlign w:val="top"/>
-          </w:tcPr>
-          <w:p>
-            <w:pPr>
-              <w:spacing w:after="0" w:line="260"/>
-            </w:pPr>
-            <w:r>
-              <w:rPr>
-                <w:rFonts w:ascii="Segoe UI" w:cs="Segoe UI" w:eastAsia="Segoe UI" w:hAnsi="Segoe UI"/>
-                <w:color w:val="22302B"/>
-                <w:sz w:val="17"/>
-                <w:szCs w:val="17"/>
-              </w:rPr>
-              <w:t xml:space="preserve">GET/POST /pets/{id}/medical-records</w:t>
+            <w:tcMar>
+              <w:top w:type="dxa" w:w="70"/>
+              <w:left w:type="dxa" w:w="120"/>
+              <w:bottom w:type="dxa" w:w="70"/>
+              <w:right w:type="dxa" w:w="120"/>
+            </w:tcMar>
+            <w:vAlign w:val="top"/>
+          </w:tcPr>
+          <w:p>
+            <w:pPr>
+              <w:spacing w:after="0" w:line="260"/>
+            </w:pPr>
+            <w:r>
+              <w:rPr>
+                <w:rFonts w:ascii="Segoe UI" w:cs="Segoe UI" w:eastAsia="Segoe UI" w:hAnsi="Segoe UI"/>
+                <w:color w:val="22302B"/>
+                <w:sz w:val="17"/>
+                <w:szCs w:val="17"/>
+              </w:rPr>
+              <w:t xml:space="preserve">GET /pets?page=&amp;search=</w:t>
             </w:r>
           </w:p>
         </w:tc>
         <w:tc>
           <w:tcPr>
             <w:tcW w:type="dxa" w:w="2150"/>
-            <w:shd w:fill="F4F8F6" w:val="clear"/>
-            <w:tcMar>
-              <w:top w:type="dxa" w:w="70"/>
-              <w:left w:type="dxa" w:w="120"/>
-              <w:bottom w:type="dxa" w:w="70"/>
-              <w:right w:type="dxa" w:w="120"/>
-            </w:tcMar>
-            <w:vAlign w:val="top"/>
-          </w:tcPr>
-          <w:p>
-            <w:pPr>
-              <w:spacing w:after="0" w:line="260"/>
-            </w:pPr>
-            <w:r>
-              <w:rPr>
-                <w:rFonts w:ascii="Segoe UI" w:cs="Segoe UI" w:eastAsia="Segoe UI" w:hAnsi="Segoe UI"/>
-                <w:color w:val="22302B"/>
-                <w:sz w:val="17"/>
-                <w:szCs w:val="17"/>
-              </w:rPr>
-              <w:t xml:space="preserve">დეტალების ახალი tab</w:t>
+            <w:tcMar>
+              <w:top w:type="dxa" w:w="70"/>
+              <w:left w:type="dxa" w:w="120"/>
+              <w:bottom w:type="dxa" w:w="70"/>
+              <w:right w:type="dxa" w:w="120"/>
+            </w:tcMar>
+            <w:vAlign w:val="top"/>
+          </w:tcPr>
+          <w:p>
+            <w:pPr>
+              <w:spacing w:after="0" w:line="260"/>
+            </w:pPr>
+            <w:r>
+              <w:rPr>
+                <w:rFonts w:ascii="Segoe UI" w:cs="Segoe UI" w:eastAsia="Segoe UI" w:hAnsi="Segoe UI"/>
+                <w:color w:val="22302B"/>
+                <w:sz w:val="17"/>
+                <w:szCs w:val="17"/>
+              </w:rPr>
+              <w:t xml:space="preserve">TanStack Query მზადაა</w:t>
             </w:r>
           </w:p>
         </w:tc>
@@ -40723,104 +41589,108 @@
         <w:tc>
           <w:tcPr>
             <w:tcW w:type="dxa" w:w="1650"/>
-            <w:tcMar>
-              <w:top w:type="dxa" w:w="70"/>
-              <w:left w:type="dxa" w:w="120"/>
-              <w:bottom w:type="dxa" w:w="70"/>
-              <w:right w:type="dxa" w:w="120"/>
-            </w:tcMar>
-            <w:vAlign w:val="top"/>
-          </w:tcPr>
-          <w:p>
-            <w:pPr>
-              <w:spacing w:after="0" w:line="260"/>
-            </w:pPr>
-            <w:r>
-              <w:rPr>
-                <w:rFonts w:ascii="Segoe UI" w:cs="Segoe UI" w:eastAsia="Segoe UI" w:hAnsi="Segoe UI"/>
-                <w:color w:val="22302B"/>
-                <w:sz w:val="17"/>
-                <w:szCs w:val="17"/>
-              </w:rPr>
-              <w:t xml:space="preserve">P1</w:t>
+            <w:shd w:fill="F4F8F6" w:val="clear"/>
+            <w:tcMar>
+              <w:top w:type="dxa" w:w="70"/>
+              <w:left w:type="dxa" w:w="120"/>
+              <w:bottom w:type="dxa" w:w="70"/>
+              <w:right w:type="dxa" w:w="120"/>
+            </w:tcMar>
+            <w:vAlign w:val="top"/>
+          </w:tcPr>
+          <w:p>
+            <w:pPr>
+              <w:spacing w:after="0" w:line="260"/>
+            </w:pPr>
+            <w:r>
+              <w:rPr>
+                <w:rFonts w:ascii="Segoe UI" w:cs="Segoe UI" w:eastAsia="Segoe UI" w:hAnsi="Segoe UI"/>
+                <w:color w:val="22302B"/>
+                <w:sz w:val="17"/>
+                <w:szCs w:val="17"/>
+              </w:rPr>
+              <w:t xml:space="preserve">P2</w:t>
             </w:r>
           </w:p>
         </w:tc>
         <w:tc>
           <w:tcPr>
             <w:tcW w:type="dxa" w:w="2950"/>
-            <w:tcMar>
-              <w:top w:type="dxa" w:w="70"/>
-              <w:left w:type="dxa" w:w="120"/>
-              <w:bottom w:type="dxa" w:w="70"/>
-              <w:right w:type="dxa" w:w="120"/>
-            </w:tcMar>
-            <w:vAlign w:val="top"/>
-          </w:tcPr>
-          <w:p>
-            <w:pPr>
-              <w:spacing w:after="0" w:line="260"/>
-            </w:pPr>
-            <w:r>
-              <w:rPr>
-                <w:rFonts w:ascii="Segoe UI" w:cs="Segoe UI" w:eastAsia="Segoe UI" w:hAnsi="Segoe UI"/>
-                <w:color w:val="22302B"/>
-                <w:sz w:val="17"/>
-                <w:szCs w:val="17"/>
-              </w:rPr>
-              <w:t xml:space="preserve">Pagination / ფილტრები</w:t>
+            <w:shd w:fill="F4F8F6" w:val="clear"/>
+            <w:tcMar>
+              <w:top w:type="dxa" w:w="70"/>
+              <w:left w:type="dxa" w:w="120"/>
+              <w:bottom w:type="dxa" w:w="70"/>
+              <w:right w:type="dxa" w:w="120"/>
+            </w:tcMar>
+            <w:vAlign w:val="top"/>
+          </w:tcPr>
+          <w:p>
+            <w:pPr>
+              <w:spacing w:after="0" w:line="260"/>
+            </w:pPr>
+            <w:r>
+              <w:rPr>
+                <w:rFonts w:ascii="Segoe UI" w:cs="Segoe UI" w:eastAsia="Segoe UI" w:hAnsi="Segoe UI"/>
+                <w:color w:val="22302B"/>
+                <w:sz w:val="17"/>
+                <w:szCs w:val="17"/>
+              </w:rPr>
+              <w:t xml:space="preserve">ავატარის ატვირთვა</w:t>
             </w:r>
           </w:p>
         </w:tc>
         <w:tc>
           <w:tcPr>
             <w:tcW w:type="dxa" w:w="2850"/>
-            <w:tcMar>
-              <w:top w:type="dxa" w:w="70"/>
-              <w:left w:type="dxa" w:w="120"/>
-              <w:bottom w:type="dxa" w:w="70"/>
-              <w:right w:type="dxa" w:w="120"/>
-            </w:tcMar>
-            <w:vAlign w:val="top"/>
-          </w:tcPr>
-          <w:p>
-            <w:pPr>
-              <w:spacing w:after="0" w:line="260"/>
-            </w:pPr>
-            <w:r>
-              <w:rPr>
-                <w:rFonts w:ascii="Segoe UI" w:cs="Segoe UI" w:eastAsia="Segoe UI" w:hAnsi="Segoe UI"/>
-                <w:color w:val="22302B"/>
-                <w:sz w:val="17"/>
-                <w:szCs w:val="17"/>
-              </w:rPr>
-              <w:t xml:space="preserve">GET /pets?page=&amp;search=</w:t>
+            <w:shd w:fill="F4F8F6" w:val="clear"/>
+            <w:tcMar>
+              <w:top w:type="dxa" w:w="70"/>
+              <w:left w:type="dxa" w:w="120"/>
+              <w:bottom w:type="dxa" w:w="70"/>
+              <w:right w:type="dxa" w:w="120"/>
+            </w:tcMar>
+            <w:vAlign w:val="top"/>
+          </w:tcPr>
+          <w:p>
+            <w:pPr>
+              <w:spacing w:after="0" w:line="260"/>
+            </w:pPr>
+            <w:r>
+              <w:rPr>
+                <w:rFonts w:ascii="Segoe UI" w:cs="Segoe UI" w:eastAsia="Segoe UI" w:hAnsi="Segoe UI"/>
+                <w:color w:val="22302B"/>
+                <w:sz w:val="17"/>
+                <w:szCs w:val="17"/>
+              </w:rPr>
+              <w:t xml:space="preserve">POST /users/{id}/avatar (multipart)</w:t>
             </w:r>
           </w:p>
         </w:tc>
         <w:tc>
           <w:tcPr>
             <w:tcW w:type="dxa" w:w="2150"/>
-            <w:tcMar>
-              <w:top w:type="dxa" w:w="70"/>
-              <w:left w:type="dxa" w:w="120"/>
-              <w:bottom w:type="dxa" w:w="70"/>
-              <w:right w:type="dxa" w:w="120"/>
-            </w:tcMar>
-            <w:vAlign w:val="top"/>
-          </w:tcPr>
-          <w:p>
-            <w:pPr>
-              <w:spacing w:after="0" w:line="260"/>
-            </w:pPr>
-            <w:r>
-              <w:rPr>
-                <w:rFonts w:ascii="Segoe UI" w:cs="Segoe UI" w:eastAsia="Segoe UI" w:hAnsi="Segoe UI"/>
-                <w:color w:val="22302B"/>
-                <w:sz w:val="17"/>
-                <w:szCs w:val="17"/>
-              </w:rPr>
-              <w:t xml:space="preserve">TanStack Query მზადაა</w:t>
+            <w:shd w:fill="F4F8F6" w:val="clear"/>
+            <w:tcMar>
+              <w:top w:type="dxa" w:w="70"/>
+              <w:left w:type="dxa" w:w="120"/>
+              <w:bottom w:type="dxa" w:w="70"/>
+              <w:right w:type="dxa" w:w="120"/>
+            </w:tcMar>
+            <w:vAlign w:val="top"/>
+          </w:tcPr>
+          <w:p>
+            <w:pPr>
+              <w:spacing w:after="0" w:line="260"/>
+            </w:pPr>
+            <w:r>
+              <w:rPr>
+                <w:rFonts w:ascii="Segoe UI" w:cs="Segoe UI" w:eastAsia="Segoe UI" w:hAnsi="Segoe UI"/>
+                <w:color w:val="22302B"/>
+                <w:sz w:val="17"/>
+                <w:szCs w:val="17"/>
+              </w:rPr>
+              <w:t xml:space="preserve">ახალი upload კომპონენტი</w:t>
             </w:r>
           </w:p>
         </w:tc>
@@ -40832,7 +41702,6 @@
         <w:tc>
           <w:tcPr>
             <w:tcW w:type="dxa" w:w="1650"/>
-            <w:shd w:fill="F4F8F6" w:val="clear"/>
             <w:tcMar>
               <w:top w:type="dxa" w:w="70"/>
               <w:left w:type="dxa" w:w="120"/>
@@ -40859,81 +41728,78 @@
         <w:tc>
           <w:tcPr>
             <w:tcW w:type="dxa" w:w="2950"/>
-            <w:shd w:fill="F4F8F6" w:val="clear"/>
-            <w:tcMar>
-              <w:top w:type="dxa" w:w="70"/>
-              <w:left w:type="dxa" w:w="120"/>
-              <w:bottom w:type="dxa" w:w="70"/>
-              <w:right w:type="dxa" w:w="120"/>
-            </w:tcMar>
-            <w:vAlign w:val="top"/>
-          </w:tcPr>
-          <w:p>
-            <w:pPr>
-              <w:spacing w:after="0" w:line="260"/>
-            </w:pPr>
-            <w:r>
-              <w:rPr>
-                <w:rFonts w:ascii="Segoe UI" w:cs="Segoe UI" w:eastAsia="Segoe UI" w:hAnsi="Segoe UI"/>
-                <w:color w:val="22302B"/>
-                <w:sz w:val="17"/>
-                <w:szCs w:val="17"/>
-              </w:rPr>
-              <w:t xml:space="preserve">ავატარის ატვირთვა</w:t>
+            <w:tcMar>
+              <w:top w:type="dxa" w:w="70"/>
+              <w:left w:type="dxa" w:w="120"/>
+              <w:bottom w:type="dxa" w:w="70"/>
+              <w:right w:type="dxa" w:w="120"/>
+            </w:tcMar>
+            <w:vAlign w:val="top"/>
+          </w:tcPr>
+          <w:p>
+            <w:pPr>
+              <w:spacing w:after="0" w:line="260"/>
+            </w:pPr>
+            <w:r>
+              <w:rPr>
+                <w:rFonts w:ascii="Segoe UI" w:cs="Segoe UI" w:eastAsia="Segoe UI" w:hAnsi="Segoe UI"/>
+                <w:color w:val="22302B"/>
+                <w:sz w:val="17"/>
+                <w:szCs w:val="17"/>
+              </w:rPr>
+              <w:t xml:space="preserve">ჯავშნები/ვიზიტები</w:t>
             </w:r>
           </w:p>
         </w:tc>
         <w:tc>
           <w:tcPr>
             <w:tcW w:type="dxa" w:w="2850"/>
-            <w:shd w:fill="F4F8F6" w:val="clear"/>
-            <w:tcMar>
-              <w:top w:type="dxa" w:w="70"/>
-              <w:left w:type="dxa" w:w="120"/>
-              <w:bottom w:type="dxa" w:w="70"/>
-              <w:right w:type="dxa" w:w="120"/>
-            </w:tcMar>
-            <w:vAlign w:val="top"/>
-          </w:tcPr>
-          <w:p>
-            <w:pPr>
-              <w:spacing w:after="0" w:line="260"/>
-            </w:pPr>
-            <w:r>
-              <w:rPr>
-                <w:rFonts w:ascii="Segoe UI" w:cs="Segoe UI" w:eastAsia="Segoe UI" w:hAnsi="Segoe UI"/>
-                <w:color w:val="22302B"/>
-                <w:sz w:val="17"/>
-                <w:szCs w:val="17"/>
-              </w:rPr>
-              <w:t xml:space="preserve">POST /users/{id}/avatar (multipart)</w:t>
+            <w:tcMar>
+              <w:top w:type="dxa" w:w="70"/>
+              <w:left w:type="dxa" w:w="120"/>
+              <w:bottom w:type="dxa" w:w="70"/>
+              <w:right w:type="dxa" w:w="120"/>
+            </w:tcMar>
+            <w:vAlign w:val="top"/>
+          </w:tcPr>
+          <w:p>
+            <w:pPr>
+              <w:spacing w:after="0" w:line="260"/>
+            </w:pPr>
+            <w:r>
+              <w:rPr>
+                <w:rFonts w:ascii="Segoe UI" w:cs="Segoe UI" w:eastAsia="Segoe UI" w:hAnsi="Segoe UI"/>
+                <w:color w:val="22302B"/>
+                <w:sz w:val="17"/>
+                <w:szCs w:val="17"/>
+              </w:rPr>
+              <w:t xml:space="preserve">appointments endpoints</w:t>
             </w:r>
           </w:p>
         </w:tc>
         <w:tc>
           <w:tcPr>
             <w:tcW w:type="dxa" w:w="2150"/>
-            <w:shd w:fill="F4F8F6" w:val="clear"/>
-            <w:tcMar>
-              <w:top w:type="dxa" w:w="70"/>
-              <w:left w:type="dxa" w:w="120"/>
-              <w:bottom w:type="dxa" w:w="70"/>
-              <w:right w:type="dxa" w:w="120"/>
-            </w:tcMar>
-            <w:vAlign w:val="top"/>
-          </w:tcPr>
-          <w:p>
-            <w:pPr>
-              <w:spacing w:after="0" w:line="260"/>
-            </w:pPr>
-            <w:r>
-              <w:rPr>
-                <w:rFonts w:ascii="Segoe UI" w:cs="Segoe UI" w:eastAsia="Segoe UI" w:hAnsi="Segoe UI"/>
-                <w:color w:val="22302B"/>
-                <w:sz w:val="17"/>
-                <w:szCs w:val="17"/>
-              </w:rPr>
-              <w:t xml:space="preserve">ახალი upload კომპონენტი</w:t>
+            <w:tcMar>
+              <w:top w:type="dxa" w:w="70"/>
+              <w:left w:type="dxa" w:w="120"/>
+              <w:bottom w:type="dxa" w:w="70"/>
+              <w:right w:type="dxa" w:w="120"/>
+            </w:tcMar>
+            <w:vAlign w:val="top"/>
+          </w:tcPr>
+          <w:p>
+            <w:pPr>
+              <w:spacing w:after="0" w:line="260"/>
+            </w:pPr>
+            <w:r>
+              <w:rPr>
+                <w:rFonts w:ascii="Segoe UI" w:cs="Segoe UI" w:eastAsia="Segoe UI" w:hAnsi="Segoe UI"/>
+                <w:color w:val="22302B"/>
+                <w:sz w:val="17"/>
+                <w:szCs w:val="17"/>
+              </w:rPr>
+              <w:t xml:space="preserve">calendar UI</w:t>
             </w:r>
           </w:p>
         </w:tc>
@@ -40945,104 +41811,108 @@
         <w:tc>
           <w:tcPr>
             <w:tcW w:type="dxa" w:w="1650"/>
-            <w:tcMar>
-              <w:top w:type="dxa" w:w="70"/>
-              <w:left w:type="dxa" w:w="120"/>
-              <w:bottom w:type="dxa" w:w="70"/>
-              <w:right w:type="dxa" w:w="120"/>
-            </w:tcMar>
-            <w:vAlign w:val="top"/>
-          </w:tcPr>
-          <w:p>
-            <w:pPr>
-              <w:spacing w:after="0" w:line="260"/>
-            </w:pPr>
-            <w:r>
-              <w:rPr>
-                <w:rFonts w:ascii="Segoe UI" w:cs="Segoe UI" w:eastAsia="Segoe UI" w:hAnsi="Segoe UI"/>
-                <w:color w:val="22302B"/>
-                <w:sz w:val="17"/>
-                <w:szCs w:val="17"/>
-              </w:rPr>
-              <w:t xml:space="preserve">P2</w:t>
+            <w:shd w:fill="F4F8F6" w:val="clear"/>
+            <w:tcMar>
+              <w:top w:type="dxa" w:w="70"/>
+              <w:left w:type="dxa" w:w="120"/>
+              <w:bottom w:type="dxa" w:w="70"/>
+              <w:right w:type="dxa" w:w="120"/>
+            </w:tcMar>
+            <w:vAlign w:val="top"/>
+          </w:tcPr>
+          <w:p>
+            <w:pPr>
+              <w:spacing w:after="0" w:line="260"/>
+            </w:pPr>
+            <w:r>
+              <w:rPr>
+                <w:rFonts w:ascii="Segoe UI" w:cs="Segoe UI" w:eastAsia="Segoe UI" w:hAnsi="Segoe UI"/>
+                <w:color w:val="22302B"/>
+                <w:sz w:val="17"/>
+                <w:szCs w:val="17"/>
+              </w:rPr>
+              <w:t xml:space="preserve">P3</w:t>
             </w:r>
           </w:p>
         </w:tc>
         <w:tc>
           <w:tcPr>
             <w:tcW w:type="dxa" w:w="2950"/>
-            <w:tcMar>
-              <w:top w:type="dxa" w:w="70"/>
-              <w:left w:type="dxa" w:w="120"/>
-              <w:bottom w:type="dxa" w:w="70"/>
-              <w:right w:type="dxa" w:w="120"/>
-            </w:tcMar>
-            <w:vAlign w:val="top"/>
-          </w:tcPr>
-          <w:p>
-            <w:pPr>
-              <w:spacing w:after="0" w:line="260"/>
-            </w:pPr>
-            <w:r>
-              <w:rPr>
-                <w:rFonts w:ascii="Segoe UI" w:cs="Segoe UI" w:eastAsia="Segoe UI" w:hAnsi="Segoe UI"/>
-                <w:color w:val="22302B"/>
-                <w:sz w:val="17"/>
-                <w:szCs w:val="17"/>
-              </w:rPr>
-              <w:t xml:space="preserve">ელ-ფოსტის ვერიფიკაცია</w:t>
+            <w:shd w:fill="F4F8F6" w:val="clear"/>
+            <w:tcMar>
+              <w:top w:type="dxa" w:w="70"/>
+              <w:left w:type="dxa" w:w="120"/>
+              <w:bottom w:type="dxa" w:w="70"/>
+              <w:right w:type="dxa" w:w="120"/>
+            </w:tcMar>
+            <w:vAlign w:val="top"/>
+          </w:tcPr>
+          <w:p>
+            <w:pPr>
+              <w:spacing w:after="0" w:line="260"/>
+            </w:pPr>
+            <w:r>
+              <w:rPr>
+                <w:rFonts w:ascii="Segoe UI" w:cs="Segoe UI" w:eastAsia="Segoe UI" w:hAnsi="Segoe UI"/>
+                <w:color w:val="22302B"/>
+                <w:sz w:val="17"/>
+                <w:szCs w:val="17"/>
+              </w:rPr>
+              <w:t xml:space="preserve">ვეტერინარები/თავშესაფრები</w:t>
             </w:r>
           </w:p>
         </w:tc>
         <w:tc>
           <w:tcPr>
             <w:tcW w:type="dxa" w:w="2850"/>
-            <w:tcMar>
-              <w:top w:type="dxa" w:w="70"/>
-              <w:left w:type="dxa" w:w="120"/>
-              <w:bottom w:type="dxa" w:w="70"/>
-              <w:right w:type="dxa" w:w="120"/>
-            </w:tcMar>
-            <w:vAlign w:val="top"/>
-          </w:tcPr>
-          <w:p>
-            <w:pPr>
-              <w:spacing w:after="0" w:line="260"/>
-            </w:pPr>
-            <w:r>
-              <w:rPr>
-                <w:rFonts w:ascii="Segoe UI" w:cs="Segoe UI" w:eastAsia="Segoe UI" w:hAnsi="Segoe UI"/>
-                <w:color w:val="22302B"/>
-                <w:sz w:val="17"/>
-                <w:szCs w:val="17"/>
-              </w:rPr>
-              <w:t xml:space="preserve">verify/resend endpoints</w:t>
+            <w:shd w:fill="F4F8F6" w:val="clear"/>
+            <w:tcMar>
+              <w:top w:type="dxa" w:w="70"/>
+              <w:left w:type="dxa" w:w="120"/>
+              <w:bottom w:type="dxa" w:w="70"/>
+              <w:right w:type="dxa" w:w="120"/>
+            </w:tcMar>
+            <w:vAlign w:val="top"/>
+          </w:tcPr>
+          <w:p>
+            <w:pPr>
+              <w:spacing w:after="0" w:line="260"/>
+            </w:pPr>
+            <w:r>
+              <w:rPr>
+                <w:rFonts w:ascii="Segoe UI" w:cs="Segoe UI" w:eastAsia="Segoe UI" w:hAnsi="Segoe UI"/>
+                <w:color w:val="22302B"/>
+                <w:sz w:val="17"/>
+                <w:szCs w:val="17"/>
+              </w:rPr>
+              <w:t xml:space="preserve">directory endpoints</w:t>
             </w:r>
           </w:p>
         </w:tc>
         <w:tc>
           <w:tcPr>
             <w:tcW w:type="dxa" w:w="2150"/>
-            <w:tcMar>
-              <w:top w:type="dxa" w:w="70"/>
-              <w:left w:type="dxa" w:w="120"/>
-              <w:bottom w:type="dxa" w:w="70"/>
-              <w:right w:type="dxa" w:w="120"/>
-            </w:tcMar>
-            <w:vAlign w:val="top"/>
-          </w:tcPr>
-          <w:p>
-            <w:pPr>
-              <w:spacing w:after="0" w:line="260"/>
-            </w:pPr>
-            <w:r>
-              <w:rPr>
-                <w:rFonts w:ascii="Segoe UI" w:cs="Segoe UI" w:eastAsia="Segoe UI" w:hAnsi="Segoe UI"/>
-                <w:color w:val="22302B"/>
-                <w:sz w:val="17"/>
-                <w:szCs w:val="17"/>
-              </w:rPr>
-              <w:t xml:space="preserve">ბეჯი + banner</w:t>
+            <w:shd w:fill="F4F8F6" w:val="clear"/>
+            <w:tcMar>
+              <w:top w:type="dxa" w:w="70"/>
+              <w:left w:type="dxa" w:w="120"/>
+              <w:bottom w:type="dxa" w:w="70"/>
+              <w:right w:type="dxa" w:w="120"/>
+            </w:tcMar>
+            <w:vAlign w:val="top"/>
+          </w:tcPr>
+          <w:p>
+            <w:pPr>
+              <w:spacing w:after="0" w:line="260"/>
+            </w:pPr>
+            <w:r>
+              <w:rPr>
+                <w:rFonts w:ascii="Segoe UI" w:cs="Segoe UI" w:eastAsia="Segoe UI" w:hAnsi="Segoe UI"/>
+                <w:color w:val="22302B"/>
+                <w:sz w:val="17"/>
+                <w:szCs w:val="17"/>
+              </w:rPr>
+              <w:t xml:space="preserve">role-based UI</w:t>
             </w:r>
           </w:p>
         </w:tc>
@@ -41054,439 +41924,230 @@
         <w:tc>
           <w:tcPr>
             <w:tcW w:type="dxa" w:w="1650"/>
-            <w:shd w:fill="F4F8F6" w:val="clear"/>
-            <w:tcMar>
-              <w:top w:type="dxa" w:w="70"/>
-              <w:left w:type="dxa" w:w="120"/>
-              <w:bottom w:type="dxa" w:w="70"/>
-              <w:right w:type="dxa" w:w="120"/>
-            </w:tcMar>
-            <w:vAlign w:val="top"/>
-          </w:tcPr>
-          <w:p>
-            <w:pPr>
-              <w:spacing w:after="0" w:line="260"/>
-            </w:pPr>
-            <w:r>
-              <w:rPr>
-                <w:rFonts w:ascii="Segoe UI" w:cs="Segoe UI" w:eastAsia="Segoe UI" w:hAnsi="Segoe UI"/>
-                <w:color w:val="22302B"/>
-                <w:sz w:val="17"/>
-                <w:szCs w:val="17"/>
-              </w:rPr>
-              <w:t xml:space="preserve">P2</w:t>
+            <w:tcMar>
+              <w:top w:type="dxa" w:w="70"/>
+              <w:left w:type="dxa" w:w="120"/>
+              <w:bottom w:type="dxa" w:w="70"/>
+              <w:right w:type="dxa" w:w="120"/>
+            </w:tcMar>
+            <w:vAlign w:val="top"/>
+          </w:tcPr>
+          <w:p>
+            <w:pPr>
+              <w:spacing w:after="0" w:line="260"/>
+            </w:pPr>
+            <w:r>
+              <w:rPr>
+                <w:rFonts w:ascii="Segoe UI" w:cs="Segoe UI" w:eastAsia="Segoe UI" w:hAnsi="Segoe UI"/>
+                <w:color w:val="22302B"/>
+                <w:sz w:val="17"/>
+                <w:szCs w:val="17"/>
+              </w:rPr>
+              <w:t xml:space="preserve">P3</w:t>
             </w:r>
           </w:p>
         </w:tc>
         <w:tc>
           <w:tcPr>
             <w:tcW w:type="dxa" w:w="2950"/>
-            <w:shd w:fill="F4F8F6" w:val="clear"/>
-            <w:tcMar>
-              <w:top w:type="dxa" w:w="70"/>
-              <w:left w:type="dxa" w:w="120"/>
-              <w:bottom w:type="dxa" w:w="70"/>
-              <w:right w:type="dxa" w:w="120"/>
-            </w:tcMar>
-            <w:vAlign w:val="top"/>
-          </w:tcPr>
-          <w:p>
-            <w:pPr>
-              <w:spacing w:after="0" w:line="260"/>
-            </w:pPr>
-            <w:r>
-              <w:rPr>
-                <w:rFonts w:ascii="Segoe UI" w:cs="Segoe UI" w:eastAsia="Segoe UI" w:hAnsi="Segoe UI"/>
-                <w:color w:val="22302B"/>
-                <w:sz w:val="17"/>
-                <w:szCs w:val="17"/>
-              </w:rPr>
-              <w:t xml:space="preserve">პაროლის აღდგენა</w:t>
+            <w:tcMar>
+              <w:top w:type="dxa" w:w="70"/>
+              <w:left w:type="dxa" w:w="120"/>
+              <w:bottom w:type="dxa" w:w="70"/>
+              <w:right w:type="dxa" w:w="120"/>
+            </w:tcMar>
+            <w:vAlign w:val="top"/>
+          </w:tcPr>
+          <w:p>
+            <w:pPr>
+              <w:spacing w:after="0" w:line="260"/>
+            </w:pPr>
+            <w:r>
+              <w:rPr>
+                <w:rFonts w:ascii="Segoe UI" w:cs="Segoe UI" w:eastAsia="Segoe UI" w:hAnsi="Segoe UI"/>
+                <w:color w:val="22302B"/>
+                <w:sz w:val="17"/>
+                <w:szCs w:val="17"/>
+              </w:rPr>
+              <w:t xml:space="preserve">შეტყობინებები</w:t>
             </w:r>
           </w:p>
         </w:tc>
         <w:tc>
           <w:tcPr>
             <w:tcW w:type="dxa" w:w="2850"/>
-            <w:shd w:fill="F4F8F6" w:val="clear"/>
-            <w:tcMar>
-              <w:top w:type="dxa" w:w="70"/>
-              <w:left w:type="dxa" w:w="120"/>
-              <w:bottom w:type="dxa" w:w="70"/>
-              <w:right w:type="dxa" w:w="120"/>
-            </w:tcMar>
-            <w:vAlign w:val="top"/>
-          </w:tcPr>
-          <w:p>
-            <w:pPr>
-              <w:spacing w:after="0" w:line="260"/>
-            </w:pPr>
-            <w:r>
-              <w:rPr>
-                <w:rFonts w:ascii="Segoe UI" w:cs="Segoe UI" w:eastAsia="Segoe UI" w:hAnsi="Segoe UI"/>
-                <w:color w:val="22302B"/>
-                <w:sz w:val="17"/>
-                <w:szCs w:val="17"/>
-              </w:rPr>
-              <w:t xml:space="preserve">forgot/reset endpoints</w:t>
+            <w:tcMar>
+              <w:top w:type="dxa" w:w="70"/>
+              <w:left w:type="dxa" w:w="120"/>
+              <w:bottom w:type="dxa" w:w="70"/>
+              <w:right w:type="dxa" w:w="120"/>
+            </w:tcMar>
+            <w:vAlign w:val="top"/>
+          </w:tcPr>
+          <w:p>
+            <w:pPr>
+              <w:spacing w:after="0" w:line="260"/>
+            </w:pPr>
+            <w:r>
+              <w:rPr>
+                <w:rFonts w:ascii="Segoe UI" w:cs="Segoe UI" w:eastAsia="Segoe UI" w:hAnsi="Segoe UI"/>
+                <w:color w:val="22302B"/>
+                <w:sz w:val="17"/>
+                <w:szCs w:val="17"/>
+              </w:rPr>
+              <w:t xml:space="preserve">notifications endpoints</w:t>
             </w:r>
           </w:p>
         </w:tc>
         <w:tc>
           <w:tcPr>
             <w:tcW w:type="dxa" w:w="2150"/>
-            <w:shd w:fill="F4F8F6" w:val="clear"/>
-            <w:tcMar>
-              <w:top w:type="dxa" w:w="70"/>
-              <w:left w:type="dxa" w:w="120"/>
-              <w:bottom w:type="dxa" w:w="70"/>
-              <w:right w:type="dxa" w:w="120"/>
-            </w:tcMar>
-            <w:vAlign w:val="top"/>
-          </w:tcPr>
-          <w:p>
-            <w:pPr>
-              <w:spacing w:after="0" w:line="260"/>
-            </w:pPr>
-            <w:r>
-              <w:rPr>
-                <w:rFonts w:ascii="Segoe UI" w:cs="Segoe UI" w:eastAsia="Segoe UI" w:hAnsi="Segoe UI"/>
-                <w:color w:val="22302B"/>
-                <w:sz w:val="17"/>
-                <w:szCs w:val="17"/>
-              </w:rPr>
-              <w:t xml:space="preserve">ორი ახალი ეკრანი</w:t>
+            <w:tcMar>
+              <w:top w:type="dxa" w:w="70"/>
+              <w:left w:type="dxa" w:w="120"/>
+              <w:bottom w:type="dxa" w:w="70"/>
+              <w:right w:type="dxa" w:w="120"/>
+            </w:tcMar>
+            <w:vAlign w:val="top"/>
+          </w:tcPr>
+          <w:p>
+            <w:pPr>
+              <w:spacing w:after="0" w:line="260"/>
+            </w:pPr>
+            <w:r>
+              <w:rPr>
+                <w:rFonts w:ascii="Segoe UI" w:cs="Segoe UI" w:eastAsia="Segoe UI" w:hAnsi="Segoe UI"/>
+                <w:color w:val="22302B"/>
+                <w:sz w:val="17"/>
+                <w:szCs w:val="17"/>
+              </w:rPr>
+              <w:t xml:space="preserve">bell + სია</w:t>
             </w:r>
           </w:p>
         </w:tc>
       </w:tr>
       <w:tr>
-        <w:trPr>
-          <w:cantSplit/>
-        </w:trPr>
         <w:tc>
           <w:tcPr>
             <w:tcW w:type="dxa" w:w="1650"/>
-            <w:tcMar>
-              <w:top w:type="dxa" w:w="70"/>
-              <w:left w:type="dxa" w:w="120"/>
-              <w:bottom w:type="dxa" w:w="70"/>
-              <w:right w:type="dxa" w:w="120"/>
-            </w:tcMar>
-            <w:vAlign w:val="top"/>
-          </w:tcPr>
-          <w:p>
-            <w:pPr>
-              <w:spacing w:after="0" w:line="260"/>
-            </w:pPr>
-            <w:r>
-              <w:rPr>
-                <w:rFonts w:ascii="Segoe UI" w:cs="Segoe UI" w:eastAsia="Segoe UI" w:hAnsi="Segoe UI"/>
-                <w:color w:val="22302B"/>
-                <w:sz w:val="17"/>
-                <w:szCs w:val="17"/>
-              </w:rPr>
-              <w:t xml:space="preserve">P2</w:t>
+          </w:tcPr>
+          <w:p>
+            <w:r>
+              <w:t>P1</w:t>
             </w:r>
           </w:p>
         </w:tc>
         <w:tc>
           <w:tcPr>
             <w:tcW w:type="dxa" w:w="2950"/>
-            <w:tcMar>
-              <w:top w:type="dxa" w:w="70"/>
-              <w:left w:type="dxa" w:w="120"/>
-              <w:bottom w:type="dxa" w:w="70"/>
-              <w:right w:type="dxa" w:w="120"/>
-            </w:tcMar>
-            <w:vAlign w:val="top"/>
-          </w:tcPr>
-          <w:p>
-            <w:pPr>
-              <w:spacing w:after="0" w:line="260"/>
-            </w:pPr>
-            <w:r>
-              <w:rPr>
-                <w:rFonts w:ascii="Segoe UI" w:cs="Segoe UI" w:eastAsia="Segoe UI" w:hAnsi="Segoe UI"/>
-                <w:color w:val="22302B"/>
-                <w:sz w:val="17"/>
-                <w:szCs w:val="17"/>
-              </w:rPr>
-              <w:t xml:space="preserve">ჯავშნები/ვიზიტები</w:t>
+          </w:tcPr>
+          <w:p>
+            <w:r>
+              <w:t>QR პროფილი / ციფრული პასპორტი</w:t>
             </w:r>
           </w:p>
         </w:tc>
         <w:tc>
           <w:tcPr>
             <w:tcW w:type="dxa" w:w="2850"/>
-            <w:tcMar>
-              <w:top w:type="dxa" w:w="70"/>
-              <w:left w:type="dxa" w:w="120"/>
-              <w:bottom w:type="dxa" w:w="70"/>
-              <w:right w:type="dxa" w:w="120"/>
-            </w:tcMar>
-            <w:vAlign w:val="top"/>
-          </w:tcPr>
-          <w:p>
-            <w:pPr>
-              <w:spacing w:after="0" w:line="260"/>
-            </w:pPr>
-            <w:r>
-              <w:rPr>
-                <w:rFonts w:ascii="Segoe UI" w:cs="Segoe UI" w:eastAsia="Segoe UI" w:hAnsi="Segoe UI"/>
-                <w:color w:val="22302B"/>
-                <w:sz w:val="17"/>
-                <w:szCs w:val="17"/>
-              </w:rPr>
-              <w:t xml:space="preserve">appointments endpoints</w:t>
+          </w:tcPr>
+          <w:p>
+            <w:r>
+              <w:t>GET /pets/{id}/qr</w:t>
             </w:r>
           </w:p>
         </w:tc>
         <w:tc>
           <w:tcPr>
             <w:tcW w:type="dxa" w:w="2150"/>
-            <w:tcMar>
-              <w:top w:type="dxa" w:w="70"/>
-              <w:left w:type="dxa" w:w="120"/>
-              <w:bottom w:type="dxa" w:w="70"/>
-              <w:right w:type="dxa" w:w="120"/>
-            </w:tcMar>
-            <w:vAlign w:val="top"/>
-          </w:tcPr>
-          <w:p>
-            <w:pPr>
-              <w:spacing w:after="0" w:line="260"/>
-            </w:pPr>
-            <w:r>
-              <w:rPr>
-                <w:rFonts w:ascii="Segoe UI" w:cs="Segoe UI" w:eastAsia="Segoe UI" w:hAnsi="Segoe UI"/>
-                <w:color w:val="22302B"/>
-                <w:sz w:val="17"/>
-                <w:szCs w:val="17"/>
-              </w:rPr>
-              <w:t xml:space="preserve">calendar UI</w:t>
+          </w:tcPr>
+          <w:p>
+            <w:r>
+              <w:t>საჭიროა backend</w:t>
             </w:r>
           </w:p>
         </w:tc>
       </w:tr>
       <w:tr>
-        <w:trPr>
-          <w:cantSplit/>
-        </w:trPr>
         <w:tc>
           <w:tcPr>
             <w:tcW w:type="dxa" w:w="1650"/>
-            <w:shd w:fill="F4F8F6" w:val="clear"/>
-            <w:tcMar>
-              <w:top w:type="dxa" w:w="70"/>
-              <w:left w:type="dxa" w:w="120"/>
-              <w:bottom w:type="dxa" w:w="70"/>
-              <w:right w:type="dxa" w:w="120"/>
-            </w:tcMar>
-            <w:vAlign w:val="top"/>
-          </w:tcPr>
-          <w:p>
-            <w:pPr>
-              <w:spacing w:after="0" w:line="260"/>
-            </w:pPr>
-            <w:r>
-              <w:rPr>
-                <w:rFonts w:ascii="Segoe UI" w:cs="Segoe UI" w:eastAsia="Segoe UI" w:hAnsi="Segoe UI"/>
-                <w:color w:val="22302B"/>
-                <w:sz w:val="17"/>
-                <w:szCs w:val="17"/>
-              </w:rPr>
-              <w:t xml:space="preserve">P3</w:t>
+          </w:tcPr>
+          <w:p>
+            <w:r>
+              <w:t>P1</w:t>
             </w:r>
           </w:p>
         </w:tc>
         <w:tc>
           <w:tcPr>
             <w:tcW w:type="dxa" w:w="2950"/>
-            <w:shd w:fill="F4F8F6" w:val="clear"/>
-            <w:tcMar>
-              <w:top w:type="dxa" w:w="70"/>
-              <w:left w:type="dxa" w:w="120"/>
-              <w:bottom w:type="dxa" w:w="70"/>
-              <w:right w:type="dxa" w:w="120"/>
-            </w:tcMar>
-            <w:vAlign w:val="top"/>
-          </w:tcPr>
-          <w:p>
-            <w:pPr>
-              <w:spacing w:after="0" w:line="260"/>
-            </w:pPr>
-            <w:r>
-              <w:rPr>
-                <w:rFonts w:ascii="Segoe UI" w:cs="Segoe UI" w:eastAsia="Segoe UI" w:hAnsi="Segoe UI"/>
-                <w:color w:val="22302B"/>
-                <w:sz w:val="17"/>
-                <w:szCs w:val="17"/>
-              </w:rPr>
-              <w:t xml:space="preserve">ვეტერინარები/თავშესაფრები</w:t>
+          </w:tcPr>
+          <w:p>
+            <w:r>
+              <w:t>ვაქცინაციები</w:t>
             </w:r>
           </w:p>
         </w:tc>
         <w:tc>
           <w:tcPr>
             <w:tcW w:type="dxa" w:w="2850"/>
-            <w:shd w:fill="F4F8F6" w:val="clear"/>
-            <w:tcMar>
-              <w:top w:type="dxa" w:w="70"/>
-              <w:left w:type="dxa" w:w="120"/>
-              <w:bottom w:type="dxa" w:w="70"/>
-              <w:right w:type="dxa" w:w="120"/>
-            </w:tcMar>
-            <w:vAlign w:val="top"/>
-          </w:tcPr>
-          <w:p>
-            <w:pPr>
-              <w:spacing w:after="0" w:line="260"/>
-            </w:pPr>
-            <w:r>
-              <w:rPr>
-                <w:rFonts w:ascii="Segoe UI" w:cs="Segoe UI" w:eastAsia="Segoe UI" w:hAnsi="Segoe UI"/>
-                <w:color w:val="22302B"/>
-                <w:sz w:val="17"/>
-                <w:szCs w:val="17"/>
-              </w:rPr>
-              <w:t xml:space="preserve">directory endpoints</w:t>
+          </w:tcPr>
+          <w:p>
+            <w:r>
+              <w:t>GET/POST /pets/{id}/vaccinations</w:t>
             </w:r>
           </w:p>
         </w:tc>
         <w:tc>
           <w:tcPr>
             <w:tcW w:type="dxa" w:w="2150"/>
-            <w:shd w:fill="F4F8F6" w:val="clear"/>
-            <w:tcMar>
-              <w:top w:type="dxa" w:w="70"/>
-              <w:left w:type="dxa" w:w="120"/>
-              <w:bottom w:type="dxa" w:w="70"/>
-              <w:right w:type="dxa" w:w="120"/>
-            </w:tcMar>
-            <w:vAlign w:val="top"/>
-          </w:tcPr>
-          <w:p>
-            <w:pPr>
-              <w:spacing w:after="0" w:line="260"/>
-            </w:pPr>
-            <w:r>
-              <w:rPr>
-                <w:rFonts w:ascii="Segoe UI" w:cs="Segoe UI" w:eastAsia="Segoe UI" w:hAnsi="Segoe UI"/>
-                <w:color w:val="22302B"/>
-                <w:sz w:val="17"/>
-                <w:szCs w:val="17"/>
-              </w:rPr>
-              <w:t xml:space="preserve">role-based UI</w:t>
+          </w:tcPr>
+          <w:p>
+            <w:r>
+              <w:t>საჭიროა backend</w:t>
             </w:r>
           </w:p>
         </w:tc>
       </w:tr>
       <w:tr>
-        <w:trPr>
-          <w:cantSplit/>
-        </w:trPr>
         <w:tc>
           <w:tcPr>
             <w:tcW w:type="dxa" w:w="1650"/>
-            <w:tcMar>
-              <w:top w:type="dxa" w:w="70"/>
-              <w:left w:type="dxa" w:w="120"/>
-              <w:bottom w:type="dxa" w:w="70"/>
-              <w:right w:type="dxa" w:w="120"/>
-            </w:tcMar>
-            <w:vAlign w:val="top"/>
-          </w:tcPr>
-          <w:p>
-            <w:pPr>
-              <w:spacing w:after="0" w:line="260"/>
-            </w:pPr>
-            <w:r>
-              <w:rPr>
-                <w:rFonts w:ascii="Segoe UI" w:cs="Segoe UI" w:eastAsia="Segoe UI" w:hAnsi="Segoe UI"/>
-                <w:color w:val="22302B"/>
-                <w:sz w:val="17"/>
-                <w:szCs w:val="17"/>
-              </w:rPr>
-              <w:t xml:space="preserve">P3</w:t>
+          </w:tcPr>
+          <w:p>
+            <w:r>
+              <w:t>P2</w:t>
             </w:r>
           </w:p>
         </w:tc>
         <w:tc>
           <w:tcPr>
             <w:tcW w:type="dxa" w:w="2950"/>
-            <w:tcMar>
-              <w:top w:type="dxa" w:w="70"/>
-              <w:left w:type="dxa" w:w="120"/>
-              <w:bottom w:type="dxa" w:w="70"/>
-              <w:right w:type="dxa" w:w="120"/>
-            </w:tcMar>
-            <w:vAlign w:val="top"/>
-          </w:tcPr>
-          <w:p>
-            <w:pPr>
-              <w:spacing w:after="0" w:line="260"/>
-            </w:pPr>
-            <w:r>
-              <w:rPr>
-                <w:rFonts w:ascii="Segoe UI" w:cs="Segoe UI" w:eastAsia="Segoe UI" w:hAnsi="Segoe UI"/>
-                <w:color w:val="22302B"/>
-                <w:sz w:val="17"/>
-                <w:szCs w:val="17"/>
-              </w:rPr>
-              <w:t xml:space="preserve">შეტყობინებები</w:t>
+          </w:tcPr>
+          <w:p>
+            <w:r>
+              <w:t>დაკარგული ცხოველის გეოლოკაცია</w:t>
             </w:r>
           </w:p>
         </w:tc>
         <w:tc>
           <w:tcPr>
             <w:tcW w:type="dxa" w:w="2850"/>
-            <w:tcMar>
-              <w:top w:type="dxa" w:w="70"/>
-              <w:left w:type="dxa" w:w="120"/>
-              <w:bottom w:type="dxa" w:w="70"/>
-              <w:right w:type="dxa" w:w="120"/>
-            </w:tcMar>
-            <w:vAlign w:val="top"/>
-          </w:tcPr>
-          <w:p>
-            <w:pPr>
-              <w:spacing w:after="0" w:line="260"/>
-            </w:pPr>
-            <w:r>
-              <w:rPr>
-                <w:rFonts w:ascii="Segoe UI" w:cs="Segoe UI" w:eastAsia="Segoe UI" w:hAnsi="Segoe UI"/>
-                <w:color w:val="22302B"/>
-                <w:sz w:val="17"/>
-                <w:szCs w:val="17"/>
-              </w:rPr>
-              <w:t xml:space="preserve">notifications endpoints</w:t>
+          </w:tcPr>
+          <w:p>
+            <w:r>
+              <w:t>location endpoints</w:t>
             </w:r>
           </w:p>
         </w:tc>
         <w:tc>
           <w:tcPr>
             <w:tcW w:type="dxa" w:w="2150"/>
-            <w:tcMar>
-              <w:top w:type="dxa" w:w="70"/>
-              <w:left w:type="dxa" w:w="120"/>
-              <w:bottom w:type="dxa" w:w="70"/>
-              <w:right w:type="dxa" w:w="120"/>
-            </w:tcMar>
-            <w:vAlign w:val="top"/>
-          </w:tcPr>
-          <w:p>
-            <w:pPr>
-              <w:spacing w:after="0" w:line="260"/>
-            </w:pPr>
-            <w:r>
-              <w:rPr>
-                <w:rFonts w:ascii="Segoe UI" w:cs="Segoe UI" w:eastAsia="Segoe UI" w:hAnsi="Segoe UI"/>
-                <w:color w:val="22302B"/>
-                <w:sz w:val="17"/>
-                <w:szCs w:val="17"/>
-              </w:rPr>
-              <w:t xml:space="preserve">bell + სია</w:t>
+          </w:tcPr>
+          <w:p>
+            <w:r>
+              <w:t>საჭიროა backend</w:t>
             </w:r>
           </w:p>
         </w:tc>
@@ -42245,6 +42906,48 @@
                 <w:szCs w:val="17"/>
               </w:rPr>
               <w:t xml:space="preserve">HappyPet გუნდი</w:t>
+            </w:r>
+          </w:p>
+        </w:tc>
+      </w:tr>
+      <w:tr>
+        <w:tc>
+          <w:tcPr>
+            <w:tcW w:type="dxa" w:w="1200"/>
+          </w:tcPr>
+          <w:p>
+            <w:r>
+              <w:t>1.2</w:t>
+            </w:r>
+          </w:p>
+        </w:tc>
+        <w:tc>
+          <w:tcPr>
+            <w:tcW w:type="dxa" w:w="1800"/>
+          </w:tcPr>
+          <w:p>
+            <w:r>
+              <w:t>27.10.2026</w:t>
+            </w:r>
+          </w:p>
+        </w:tc>
+        <w:tc>
+          <w:tcPr>
+            <w:tcW w:type="dxa" w:w="4800"/>
+          </w:tcPr>
+          <w:p>
+            <w:r>
+              <w:t>ელ-ფოსტის ვერიფიკაცია და პაროლის აღდგენა OTP-ით; pet ფოტოები; int ID; isEmailVerified/emailVerifiedAt</w:t>
+            </w:r>
+          </w:p>
+        </w:tc>
+        <w:tc>
+          <w:tcPr>
+            <w:tcW w:type="dxa" w:w="1800"/>
+          </w:tcPr>
+          <w:p>
+            <w:r>
+              <w:t>HappyPet გუნდი</w:t>
             </w:r>
           </w:p>
         </w:tc>

</xml_diff>

<commit_message>
Reject verify-email for already verified accounts
</commit_message>
<xml_diff>
--- a/docs/HappyPet-Frontend-Integration-Guide.docx
+++ b/docs/HappyPet-Frontend-Integration-Guide.docx
@@ -8334,6 +8334,22 @@
       </w:pPr>
       <w:r>
         <w:t>verify-email: email + code; წარმატების შემდეგ login შესაძლებელია.</w:t>
+      </w:r>
+    </w:p>
+    <w:p>
+      <w:pPr>
+        <w:pStyle w:val="ListParagraph"/>
+      </w:pPr>
+      <w:r>
+        <w:t>OTP purpose-scoped-ია: reset-password-ის კოდი ვერ დაადასტურებს email-ს და პირიქით.</w:t>
+      </w:r>
+    </w:p>
+    <w:p>
+      <w:pPr>
+        <w:pStyle w:val="ListParagraph"/>
+      </w:pPr>
+      <w:r>
+        <w:t>თუ email უკვე დადასტურებულია, verify-email აბრუნებს 400-ს („ელ-ფოსტა უკვე დადასტურებულია.“) და კოდს არ იღებს.</w:t>
       </w:r>
     </w:p>
     <w:p>

</xml_diff>